<commit_message>
Replaced syllabus v1 with v2
</commit_message>
<xml_diff>
--- a/AI-Enabled_Informatics_Syllabus_Spring2026_FINAL (as of 19JAN26).docx
+++ b/AI-Enabled_Informatics_Syllabus_Spring2026_FINAL (as of 19JAN26).docx
@@ -61,6 +61,8 @@
         <w:spacing w:before="100" w:beforeAutospacing="1" w:after="100" w:afterAutospacing="1" w:line="240" w:lineRule="auto"/>
         <w:rPr>
           <w:rFonts w:ascii="Times New Roman" w:eastAsia="Times New Roman" w:hAnsi="Times New Roman" w:cs="Times New Roman"/>
+          <w:b/>
+          <w:bCs/>
           <w:kern w:val="0"/>
           <w14:ligatures w14:val="none"/>
         </w:rPr>
@@ -89,182 +91,17 @@
           <w:kern w:val="0"/>
           <w14:ligatures w14:val="none"/>
         </w:rPr>
-        <w:br/>
-      </w:r>
-      <w:r>
-        <w:rPr>
-          <w:rFonts w:ascii="Times New Roman" w:eastAsia="Times New Roman" w:hAnsi="Times New Roman" w:cs="Times New Roman"/>
-          <w:b/>
-          <w:bCs/>
-          <w:kern w:val="0"/>
-          <w14:ligatures w14:val="none"/>
-        </w:rPr>
-        <w:t>Term:</w:t>
-      </w:r>
-      <w:r>
-        <w:rPr>
-          <w:rFonts w:ascii="Times New Roman" w:eastAsia="Times New Roman" w:hAnsi="Times New Roman" w:cs="Times New Roman"/>
-          <w:kern w:val="0"/>
-          <w14:ligatures w14:val="none"/>
-        </w:rPr>
-        <w:t xml:space="preserve"> Spring 2026</w:t>
-      </w:r>
-      <w:r>
-        <w:rPr>
-          <w:rFonts w:ascii="Times New Roman" w:eastAsia="Times New Roman" w:hAnsi="Times New Roman" w:cs="Times New Roman"/>
-          <w:kern w:val="0"/>
-          <w14:ligatures w14:val="none"/>
-        </w:rPr>
-        <w:br/>
-      </w:r>
-      <w:r>
-        <w:rPr>
-          <w:rFonts w:ascii="Times New Roman" w:eastAsia="Times New Roman" w:hAnsi="Times New Roman" w:cs="Times New Roman"/>
-          <w:b/>
-          <w:bCs/>
-          <w:kern w:val="0"/>
-          <w14:ligatures w14:val="none"/>
-        </w:rPr>
-        <w:t>Format:</w:t>
-      </w:r>
-      <w:r>
-        <w:rPr>
-          <w:rFonts w:ascii="Times New Roman" w:eastAsia="Times New Roman" w:hAnsi="Times New Roman" w:cs="Times New Roman"/>
-          <w:kern w:val="0"/>
-          <w14:ligatures w14:val="none"/>
-        </w:rPr>
-        <w:t xml:space="preserve"> Asynchronous weekly modules (recorded lectures + tools-based activities)</w:t>
-      </w:r>
-      <w:r>
-        <w:rPr>
-          <w:rFonts w:ascii="Times New Roman" w:eastAsia="Times New Roman" w:hAnsi="Times New Roman" w:cs="Times New Roman"/>
-          <w:kern w:val="0"/>
-          <w14:ligatures w14:val="none"/>
-        </w:rPr>
-        <w:br/>
-      </w:r>
-      <w:r>
-        <w:rPr>
-          <w:rFonts w:ascii="Times New Roman" w:eastAsia="Times New Roman" w:hAnsi="Times New Roman" w:cs="Times New Roman"/>
-          <w:b/>
-          <w:bCs/>
-          <w:kern w:val="0"/>
-          <w14:ligatures w14:val="none"/>
-        </w:rPr>
-        <w:t>Optional Zoom (Q&amp;A / working session):</w:t>
-      </w:r>
-      <w:r>
-        <w:rPr>
-          <w:rFonts w:ascii="Times New Roman" w:eastAsia="Times New Roman" w:hAnsi="Times New Roman" w:cs="Times New Roman"/>
-          <w:kern w:val="0"/>
-          <w14:ligatures w14:val="none"/>
-        </w:rPr>
-        <w:t xml:space="preserve"> Wednesdays 7:00–8:00 PM ET (starting Jan 20, 2026)</w:t>
-      </w:r>
-      <w:r>
-        <w:rPr>
-          <w:rFonts w:ascii="Times New Roman" w:eastAsia="Times New Roman" w:hAnsi="Times New Roman" w:cs="Times New Roman"/>
-          <w:kern w:val="0"/>
-          <w14:ligatures w14:val="none"/>
-        </w:rPr>
-        <w:br/>
-      </w:r>
-      <w:r>
-        <w:rPr>
-          <w:rFonts w:ascii="Times New Roman" w:eastAsia="Times New Roman" w:hAnsi="Times New Roman" w:cs="Times New Roman"/>
-          <w:b/>
-          <w:bCs/>
-          <w:kern w:val="0"/>
-          <w14:ligatures w14:val="none"/>
-        </w:rPr>
-        <w:t>Office Hours:</w:t>
-      </w:r>
-      <w:r>
-        <w:rPr>
-          <w:rFonts w:ascii="Times New Roman" w:eastAsia="Times New Roman" w:hAnsi="Times New Roman" w:cs="Times New Roman"/>
-          <w:kern w:val="0"/>
-          <w14:ligatures w14:val="none"/>
-        </w:rPr>
-        <w:t xml:space="preserve"> By request</w:t>
-      </w:r>
-      <w:r>
-        <w:rPr>
-          <w:rFonts w:ascii="Times New Roman" w:eastAsia="Times New Roman" w:hAnsi="Times New Roman" w:cs="Times New Roman"/>
-          <w:kern w:val="0"/>
-          <w14:ligatures w14:val="none"/>
-        </w:rPr>
-        <w:br/>
-      </w:r>
-      <w:r>
-        <w:rPr>
-          <w:rFonts w:ascii="Times New Roman" w:eastAsia="Times New Roman" w:hAnsi="Times New Roman" w:cs="Times New Roman"/>
-          <w:b/>
-          <w:bCs/>
-          <w:kern w:val="0"/>
-          <w14:ligatures w14:val="none"/>
-        </w:rPr>
-        <w:t>Contact:</w:t>
-      </w:r>
-      <w:r>
-        <w:rPr>
-          <w:rFonts w:ascii="Times New Roman" w:eastAsia="Times New Roman" w:hAnsi="Times New Roman" w:cs="Times New Roman"/>
-          <w:kern w:val="0"/>
-          <w14:ligatures w14:val="none"/>
-        </w:rPr>
-        <w:t xml:space="preserve"> </w:t>
-      </w:r>
-      <w:r>
-        <w:rPr>
-          <w:rFonts w:ascii="Times New Roman" w:eastAsia="Times New Roman" w:hAnsi="Times New Roman" w:cs="Times New Roman"/>
-          <w:kern w:val="0"/>
-          <w14:ligatures w14:val="none"/>
-        </w:rPr>
-        <w:t>ri128</w:t>
-      </w:r>
-      <w:r>
-        <w:rPr>
-          <w:rFonts w:ascii="Times New Roman" w:eastAsia="Times New Roman" w:hAnsi="Times New Roman" w:cs="Times New Roman"/>
-          <w:kern w:val="0"/>
-          <w14:ligatures w14:val="none"/>
-        </w:rPr>
-        <w:t>@rutgers.edu</w:t>
-      </w:r>
-      <w:r>
-        <w:rPr>
-          <w:rFonts w:ascii="Times New Roman" w:eastAsia="Times New Roman" w:hAnsi="Times New Roman" w:cs="Times New Roman"/>
-          <w:kern w:val="0"/>
-          <w14:ligatures w14:val="none"/>
-        </w:rPr>
-        <w:br/>
-      </w:r>
-      <w:r>
-        <w:rPr>
-          <w:rFonts w:ascii="Times New Roman" w:eastAsia="Times New Roman" w:hAnsi="Times New Roman" w:cs="Times New Roman"/>
-          <w:b/>
-          <w:bCs/>
-          <w:kern w:val="0"/>
-          <w14:ligatures w14:val="none"/>
-        </w:rPr>
-        <w:t>Course Site:</w:t>
-      </w:r>
-      <w:r>
-        <w:rPr>
-          <w:rFonts w:ascii="Times New Roman" w:eastAsia="Times New Roman" w:hAnsi="Times New Roman" w:cs="Times New Roman"/>
-          <w:kern w:val="0"/>
-          <w14:ligatures w14:val="none"/>
-        </w:rPr>
-        <w:t xml:space="preserve"> Rutgers Canvas (announcements, submissions, grades): </w:t>
-      </w:r>
-      <w:hyperlink r:id="rId5" w:tgtFrame="_new" w:history="1">
+        <w:t xml:space="preserve"> (</w:t>
+      </w:r>
+      <w:hyperlink r:id="rId7" w:history="1">
         <w:r>
           <w:rPr>
+            <w:rStyle w:val="Hyperlink"/>
             <w:rFonts w:ascii="Times New Roman" w:eastAsia="Times New Roman" w:hAnsi="Times New Roman" w:cs="Times New Roman"/>
-            <w:color w:val="0000FF"/>
             <w:kern w:val="0"/>
-            <w:u w:val="single"/>
             <w14:ligatures w14:val="none"/>
           </w:rPr>
-          <w:t>https://canvas.rutgers.edu/</w:t>
+          <w:t>ri128@rutgers.edu</w:t>
         </w:r>
       </w:hyperlink>
       <w:r>
@@ -273,6 +110,14 @@
           <w:kern w:val="0"/>
           <w14:ligatures w14:val="none"/>
         </w:rPr>
+        <w:t>)</w:t>
+      </w:r>
+      <w:r>
+        <w:rPr>
+          <w:rFonts w:ascii="Times New Roman" w:eastAsia="Times New Roman" w:hAnsi="Times New Roman" w:cs="Times New Roman"/>
+          <w:kern w:val="0"/>
+          <w14:ligatures w14:val="none"/>
+        </w:rPr>
         <w:t xml:space="preserve"> </w:t>
       </w:r>
       <w:r>
@@ -281,8 +126,611 @@
           <w:kern w:val="0"/>
           <w14:ligatures w14:val="none"/>
         </w:rPr>
-        <w:t xml:space="preserve"> AND GitHub for lecture materials*</w:t>
-      </w:r>
+        <w:br/>
+      </w:r>
+      <w:r>
+        <w:rPr>
+          <w:rFonts w:ascii="Times New Roman" w:eastAsia="Times New Roman" w:hAnsi="Times New Roman" w:cs="Times New Roman"/>
+          <w:b/>
+          <w:bCs/>
+          <w:kern w:val="0"/>
+          <w14:ligatures w14:val="none"/>
+        </w:rPr>
+        <w:t>TA:</w:t>
+      </w:r>
+      <w:r>
+        <w:rPr>
+          <w:rFonts w:ascii="Times New Roman" w:eastAsia="Times New Roman" w:hAnsi="Times New Roman" w:cs="Times New Roman"/>
+          <w:b/>
+          <w:bCs/>
+          <w:kern w:val="0"/>
+          <w14:ligatures w14:val="none"/>
+        </w:rPr>
+        <w:t xml:space="preserve"> </w:t>
+      </w:r>
+      <w:r>
+        <w:rPr>
+          <w:rFonts w:ascii="Times New Roman" w:eastAsia="Times New Roman" w:hAnsi="Times New Roman" w:cs="Times New Roman"/>
+          <w:kern w:val="0"/>
+          <w14:ligatures w14:val="none"/>
+        </w:rPr>
+        <w:t>Keya Wang,</w:t>
+      </w:r>
+      <w:r>
+        <w:rPr>
+          <w:rFonts w:ascii="Times New Roman" w:eastAsia="Times New Roman" w:hAnsi="Times New Roman" w:cs="Times New Roman"/>
+          <w:b/>
+          <w:bCs/>
+          <w:kern w:val="0"/>
+          <w14:ligatures w14:val="none"/>
+        </w:rPr>
+        <w:t xml:space="preserve"> </w:t>
+      </w:r>
+      <w:r>
+        <w:rPr>
+          <w:rFonts w:ascii="Times New Roman" w:eastAsia="Times New Roman" w:hAnsi="Times New Roman" w:cs="Times New Roman"/>
+          <w:b/>
+          <w:bCs/>
+          <w:kern w:val="0"/>
+          <w14:ligatures w14:val="none"/>
+        </w:rPr>
+        <w:t>(</w:t>
+      </w:r>
+      <w:hyperlink r:id="rId8" w:history="1">
+        <w:r>
+          <w:rPr>
+            <w:rStyle w:val="Hyperlink"/>
+            <w:rFonts w:ascii="Times New Roman" w:eastAsia="Times New Roman" w:hAnsi="Times New Roman" w:cs="Times New Roman"/>
+            <w:kern w:val="0"/>
+            <w14:ligatures w14:val="none"/>
+          </w:rPr>
+          <w:t>kw653@scarletmail.rutgers.edu</w:t>
+        </w:r>
+      </w:hyperlink>
+      <w:r>
+        <w:rPr>
+          <w:rFonts w:ascii="Times New Roman" w:eastAsia="Times New Roman" w:hAnsi="Times New Roman" w:cs="Times New Roman"/>
+          <w:kern w:val="0"/>
+          <w14:ligatures w14:val="none"/>
+        </w:rPr>
+        <w:t>)</w:t>
+      </w:r>
+    </w:p>
+    <w:p>
+      <w:pPr>
+        <w:spacing w:before="100" w:beforeAutospacing="1" w:after="100" w:afterAutospacing="1" w:line="240" w:lineRule="auto"/>
+        <w:rPr>
+          <w:rFonts w:ascii="Times New Roman" w:eastAsia="Times New Roman" w:hAnsi="Times New Roman" w:cs="Times New Roman"/>
+          <w:kern w:val="0"/>
+          <w14:ligatures w14:val="none"/>
+        </w:rPr>
+      </w:pPr>
+      <w:r>
+        <w:rPr>
+          <w:rFonts w:ascii="Times New Roman" w:eastAsia="Times New Roman" w:hAnsi="Times New Roman" w:cs="Times New Roman"/>
+          <w:b/>
+          <w:bCs/>
+          <w:kern w:val="0"/>
+          <w14:ligatures w14:val="none"/>
+        </w:rPr>
+        <w:t>Term:</w:t>
+      </w:r>
+      <w:r>
+        <w:rPr>
+          <w:rFonts w:ascii="Times New Roman" w:eastAsia="Times New Roman" w:hAnsi="Times New Roman" w:cs="Times New Roman"/>
+          <w:kern w:val="0"/>
+          <w14:ligatures w14:val="none"/>
+        </w:rPr>
+        <w:t xml:space="preserve"> Spring 2026</w:t>
+      </w:r>
+      <w:r>
+        <w:rPr>
+          <w:rFonts w:ascii="Times New Roman" w:eastAsia="Times New Roman" w:hAnsi="Times New Roman" w:cs="Times New Roman"/>
+          <w:kern w:val="0"/>
+          <w14:ligatures w14:val="none"/>
+        </w:rPr>
+        <w:br/>
+      </w:r>
+      <w:r>
+        <w:rPr>
+          <w:rFonts w:ascii="Times New Roman" w:eastAsia="Times New Roman" w:hAnsi="Times New Roman" w:cs="Times New Roman"/>
+          <w:b/>
+          <w:bCs/>
+          <w:kern w:val="0"/>
+          <w14:ligatures w14:val="none"/>
+        </w:rPr>
+        <w:t>Asynchronous</w:t>
+      </w:r>
+      <w:r>
+        <w:rPr>
+          <w:rFonts w:ascii="Times New Roman" w:eastAsia="Times New Roman" w:hAnsi="Times New Roman" w:cs="Times New Roman"/>
+          <w:b/>
+          <w:bCs/>
+          <w:kern w:val="0"/>
+          <w14:ligatures w14:val="none"/>
+        </w:rPr>
+        <w:t xml:space="preserve"> Lectures</w:t>
+      </w:r>
+      <w:r>
+        <w:rPr>
+          <w:rFonts w:ascii="Times New Roman" w:eastAsia="Times New Roman" w:hAnsi="Times New Roman" w:cs="Times New Roman"/>
+          <w:b/>
+          <w:bCs/>
+          <w:kern w:val="0"/>
+          <w14:ligatures w14:val="none"/>
+        </w:rPr>
+        <w:t>:</w:t>
+      </w:r>
+      <w:r>
+        <w:rPr>
+          <w:rFonts w:ascii="Times New Roman" w:eastAsia="Times New Roman" w:hAnsi="Times New Roman" w:cs="Times New Roman"/>
+          <w:kern w:val="0"/>
+          <w14:ligatures w14:val="none"/>
+        </w:rPr>
+        <w:t xml:space="preserve"> </w:t>
+      </w:r>
+      <w:r>
+        <w:rPr>
+          <w:rFonts w:ascii="Times New Roman" w:eastAsia="Times New Roman" w:hAnsi="Times New Roman" w:cs="Times New Roman"/>
+          <w:kern w:val="0"/>
+          <w14:ligatures w14:val="none"/>
+        </w:rPr>
+        <w:t>Weekly Lecture Recordings</w:t>
+      </w:r>
+      <w:r>
+        <w:rPr>
+          <w:rFonts w:ascii="Times New Roman" w:eastAsia="Times New Roman" w:hAnsi="Times New Roman" w:cs="Times New Roman"/>
+          <w:kern w:val="0"/>
+          <w14:ligatures w14:val="none"/>
+        </w:rPr>
+        <w:t xml:space="preserve"> (Posted to ZOOM Tuesday evenings)</w:t>
+      </w:r>
+      <w:r>
+        <w:rPr>
+          <w:rFonts w:ascii="Times New Roman" w:eastAsia="Times New Roman" w:hAnsi="Times New Roman" w:cs="Times New Roman"/>
+          <w:kern w:val="0"/>
+          <w14:ligatures w14:val="none"/>
+        </w:rPr>
+        <w:t xml:space="preserve"> – see Appendix C</w:t>
+      </w:r>
+      <w:r>
+        <w:rPr>
+          <w:rFonts w:ascii="Times New Roman" w:eastAsia="Times New Roman" w:hAnsi="Times New Roman" w:cs="Times New Roman"/>
+          <w:kern w:val="0"/>
+          <w14:ligatures w14:val="none"/>
+        </w:rPr>
+        <w:t xml:space="preserve"> </w:t>
+      </w:r>
+      <w:r>
+        <w:rPr>
+          <w:rFonts w:ascii="Times New Roman" w:eastAsia="Times New Roman" w:hAnsi="Times New Roman" w:cs="Times New Roman"/>
+          <w:kern w:val="0"/>
+          <w14:ligatures w14:val="none"/>
+        </w:rPr>
+        <w:t xml:space="preserve">for full Zoom details </w:t>
+      </w:r>
+      <w:r>
+        <w:rPr>
+          <w:rFonts w:ascii="Times New Roman" w:eastAsia="Times New Roman" w:hAnsi="Times New Roman" w:cs="Times New Roman"/>
+          <w:kern w:val="0"/>
+          <w14:ligatures w14:val="none"/>
+        </w:rPr>
+        <w:t>(</w:t>
+      </w:r>
+      <w:hyperlink r:id="rId9" w:history="1">
+        <w:r>
+          <w:rPr>
+            <w:rStyle w:val="Hyperlink"/>
+            <w:rFonts w:ascii="Times New Roman" w:eastAsia="Times New Roman" w:hAnsi="Times New Roman" w:cs="Times New Roman"/>
+            <w:kern w:val="0"/>
+            <w14:ligatures w14:val="none"/>
+          </w:rPr>
+          <w:t>https://rutgers.zoom.us/j/91287883862?pwd=PiErrbHksviZpre1dVv4fu51PgaPhs.1</w:t>
+        </w:r>
+      </w:hyperlink>
+      <w:r>
+        <w:rPr>
+          <w:rFonts w:ascii="Times New Roman" w:eastAsia="Times New Roman" w:hAnsi="Times New Roman" w:cs="Times New Roman"/>
+          <w:kern w:val="0"/>
+          <w14:ligatures w14:val="none"/>
+        </w:rPr>
+        <w:t>)</w:t>
+      </w:r>
+      <w:r>
+        <w:rPr>
+          <w:rFonts w:ascii="Times New Roman" w:eastAsia="Times New Roman" w:hAnsi="Times New Roman" w:cs="Times New Roman"/>
+          <w:kern w:val="0"/>
+          <w14:ligatures w14:val="none"/>
+        </w:rPr>
+        <w:br/>
+      </w:r>
+      <w:r>
+        <w:rPr>
+          <w:rFonts w:ascii="Times New Roman" w:eastAsia="Times New Roman" w:hAnsi="Times New Roman" w:cs="Times New Roman"/>
+          <w:b/>
+          <w:bCs/>
+          <w:kern w:val="0"/>
+          <w14:ligatures w14:val="none"/>
+        </w:rPr>
+        <w:t>Required Synchronous</w:t>
+      </w:r>
+      <w:r>
+        <w:rPr>
+          <w:rFonts w:ascii="Times New Roman" w:eastAsia="Times New Roman" w:hAnsi="Times New Roman" w:cs="Times New Roman"/>
+          <w:b/>
+          <w:bCs/>
+          <w:kern w:val="0"/>
+          <w14:ligatures w14:val="none"/>
+        </w:rPr>
+        <w:t xml:space="preserve"> TA Sessions</w:t>
+      </w:r>
+      <w:r>
+        <w:rPr>
+          <w:rFonts w:ascii="Times New Roman" w:eastAsia="Times New Roman" w:hAnsi="Times New Roman" w:cs="Times New Roman"/>
+          <w:b/>
+          <w:bCs/>
+          <w:kern w:val="0"/>
+          <w14:ligatures w14:val="none"/>
+        </w:rPr>
+        <w:t>:</w:t>
+      </w:r>
+      <w:r>
+        <w:rPr>
+          <w:rFonts w:ascii="Times New Roman" w:eastAsia="Times New Roman" w:hAnsi="Times New Roman" w:cs="Times New Roman"/>
+          <w:kern w:val="0"/>
+          <w14:ligatures w14:val="none"/>
+        </w:rPr>
+        <w:t xml:space="preserve"> </w:t>
+      </w:r>
+      <w:r>
+        <w:rPr>
+          <w:rFonts w:ascii="Times New Roman" w:eastAsia="Times New Roman" w:hAnsi="Times New Roman" w:cs="Times New Roman"/>
+          <w:kern w:val="0"/>
+          <w14:ligatures w14:val="none"/>
+        </w:rPr>
+        <w:t>Monday</w:t>
+      </w:r>
+      <w:r>
+        <w:rPr>
+          <w:rFonts w:ascii="Times New Roman" w:eastAsia="Times New Roman" w:hAnsi="Times New Roman" w:cs="Times New Roman"/>
+          <w:kern w:val="0"/>
+          <w14:ligatures w14:val="none"/>
+        </w:rPr>
+        <w:t xml:space="preserve"> (</w:t>
+      </w:r>
+      <w:r>
+        <w:rPr>
+          <w:rFonts w:ascii="Times New Roman" w:eastAsia="Times New Roman" w:hAnsi="Times New Roman" w:cs="Times New Roman"/>
+          <w:kern w:val="0"/>
+          <w14:ligatures w14:val="none"/>
+        </w:rPr>
+        <w:t>12</w:t>
+      </w:r>
+      <w:r>
+        <w:rPr>
+          <w:rFonts w:ascii="Times New Roman" w:eastAsia="Times New Roman" w:hAnsi="Times New Roman" w:cs="Times New Roman"/>
+          <w:kern w:val="0"/>
+          <w14:ligatures w14:val="none"/>
+        </w:rPr>
+        <w:t>:10</w:t>
+      </w:r>
+      <w:r>
+        <w:rPr>
+          <w:rFonts w:ascii="Times New Roman" w:eastAsia="Times New Roman" w:hAnsi="Times New Roman" w:cs="Times New Roman"/>
+          <w:kern w:val="0"/>
+          <w14:ligatures w14:val="none"/>
+        </w:rPr>
+        <w:t>-</w:t>
+      </w:r>
+      <w:r>
+        <w:rPr>
+          <w:rFonts w:ascii="Times New Roman" w:eastAsia="Times New Roman" w:hAnsi="Times New Roman" w:cs="Times New Roman"/>
+          <w:kern w:val="0"/>
+          <w14:ligatures w14:val="none"/>
+        </w:rPr>
+        <w:t>130</w:t>
+      </w:r>
+      <w:r>
+        <w:rPr>
+          <w:rFonts w:ascii="Times New Roman" w:eastAsia="Times New Roman" w:hAnsi="Times New Roman" w:cs="Times New Roman"/>
+          <w:kern w:val="0"/>
+          <w14:ligatures w14:val="none"/>
+        </w:rPr>
+        <w:t>pm ET</w:t>
+      </w:r>
+      <w:r>
+        <w:rPr>
+          <w:rFonts w:ascii="Times New Roman" w:eastAsia="Times New Roman" w:hAnsi="Times New Roman" w:cs="Times New Roman"/>
+          <w:kern w:val="0"/>
+          <w14:ligatures w14:val="none"/>
+        </w:rPr>
+        <w:t xml:space="preserve">) </w:t>
+      </w:r>
+      <w:r>
+        <w:rPr>
+          <w:rFonts w:ascii="Times New Roman" w:eastAsia="Times New Roman" w:hAnsi="Times New Roman" w:cs="Times New Roman"/>
+          <w:kern w:val="0"/>
+          <w14:ligatures w14:val="none"/>
+        </w:rPr>
+        <w:t>&amp;</w:t>
+      </w:r>
+      <w:r>
+        <w:rPr>
+          <w:rFonts w:ascii="Times New Roman" w:eastAsia="Times New Roman" w:hAnsi="Times New Roman" w:cs="Times New Roman"/>
+          <w:kern w:val="0"/>
+          <w14:ligatures w14:val="none"/>
+        </w:rPr>
+        <w:t xml:space="preserve"> Thursday (12</w:t>
+      </w:r>
+      <w:r>
+        <w:rPr>
+          <w:rFonts w:ascii="Times New Roman" w:eastAsia="Times New Roman" w:hAnsi="Times New Roman" w:cs="Times New Roman"/>
+          <w:kern w:val="0"/>
+          <w14:ligatures w14:val="none"/>
+        </w:rPr>
+        <w:t>:10</w:t>
+      </w:r>
+      <w:r>
+        <w:rPr>
+          <w:rFonts w:ascii="Times New Roman" w:eastAsia="Times New Roman" w:hAnsi="Times New Roman" w:cs="Times New Roman"/>
+          <w:kern w:val="0"/>
+          <w14:ligatures w14:val="none"/>
+        </w:rPr>
+        <w:t>-</w:t>
+      </w:r>
+      <w:r>
+        <w:rPr>
+          <w:rFonts w:ascii="Times New Roman" w:eastAsia="Times New Roman" w:hAnsi="Times New Roman" w:cs="Times New Roman"/>
+          <w:kern w:val="0"/>
+          <w14:ligatures w14:val="none"/>
+        </w:rPr>
+        <w:t>1:30</w:t>
+      </w:r>
+      <w:r>
+        <w:rPr>
+          <w:rFonts w:ascii="Times New Roman" w:eastAsia="Times New Roman" w:hAnsi="Times New Roman" w:cs="Times New Roman"/>
+          <w:kern w:val="0"/>
+          <w14:ligatures w14:val="none"/>
+        </w:rPr>
+        <w:t>pm)</w:t>
+      </w:r>
+      <w:r>
+        <w:rPr>
+          <w:rFonts w:ascii="Times New Roman" w:eastAsia="Times New Roman" w:hAnsi="Times New Roman" w:cs="Times New Roman"/>
+          <w:kern w:val="0"/>
+          <w14:ligatures w14:val="none"/>
+        </w:rPr>
+        <w:t xml:space="preserve"> </w:t>
+      </w:r>
+      <w:r>
+        <w:rPr>
+          <w:rFonts w:ascii="Times New Roman" w:eastAsia="Times New Roman" w:hAnsi="Times New Roman" w:cs="Times New Roman"/>
+          <w:kern w:val="0"/>
+          <w14:ligatures w14:val="none"/>
+        </w:rPr>
+        <w:t>– see Appendix C for full Zoom Information</w:t>
+      </w:r>
+      <w:r>
+        <w:rPr>
+          <w:rFonts w:ascii="Times New Roman" w:eastAsia="Times New Roman" w:hAnsi="Times New Roman" w:cs="Times New Roman"/>
+          <w:kern w:val="0"/>
+          <w14:ligatures w14:val="none"/>
+        </w:rPr>
+        <w:t xml:space="preserve"> (</w:t>
+      </w:r>
+      <w:hyperlink r:id="rId10" w:history="1">
+        <w:r>
+          <w:rPr>
+            <w:rStyle w:val="Hyperlink"/>
+            <w:rFonts w:ascii="Times New Roman" w:eastAsia="Times New Roman" w:hAnsi="Times New Roman" w:cs="Times New Roman"/>
+            <w:kern w:val="0"/>
+            <w14:ligatures w14:val="none"/>
+          </w:rPr>
+          <w:t>https://rutgers.zoom.us/j/99163542603?pwd=Y6Geby7WVwbWrMawgW8PFXnwmMNQjp.1</w:t>
+        </w:r>
+      </w:hyperlink>
+      <w:r>
+        <w:rPr>
+          <w:rFonts w:ascii="Times New Roman" w:eastAsia="Times New Roman" w:hAnsi="Times New Roman" w:cs="Times New Roman"/>
+          <w:kern w:val="0"/>
+          <w14:ligatures w14:val="none"/>
+        </w:rPr>
+        <w:t>)</w:t>
+      </w:r>
+      <w:r>
+        <w:rPr>
+          <w:rFonts w:ascii="Times New Roman" w:eastAsia="Times New Roman" w:hAnsi="Times New Roman" w:cs="Times New Roman"/>
+          <w:kern w:val="0"/>
+          <w14:ligatures w14:val="none"/>
+        </w:rPr>
+        <w:br/>
+      </w:r>
+      <w:r>
+        <w:rPr>
+          <w:rFonts w:ascii="Times New Roman" w:eastAsia="Times New Roman" w:hAnsi="Times New Roman" w:cs="Times New Roman"/>
+          <w:b/>
+          <w:bCs/>
+          <w:kern w:val="0"/>
+          <w14:ligatures w14:val="none"/>
+        </w:rPr>
+        <w:t>Office Hours:</w:t>
+      </w:r>
+      <w:r>
+        <w:rPr>
+          <w:rFonts w:ascii="Times New Roman" w:eastAsia="Times New Roman" w:hAnsi="Times New Roman" w:cs="Times New Roman"/>
+          <w:kern w:val="0"/>
+          <w14:ligatures w14:val="none"/>
+        </w:rPr>
+        <w:t xml:space="preserve"> By request</w:t>
+      </w:r>
+      <w:r>
+        <w:rPr>
+          <w:rFonts w:ascii="Times New Roman" w:eastAsia="Times New Roman" w:hAnsi="Times New Roman" w:cs="Times New Roman"/>
+          <w:kern w:val="0"/>
+          <w14:ligatures w14:val="none"/>
+        </w:rPr>
+        <w:br/>
+      </w:r>
+      <w:r>
+        <w:rPr>
+          <w:rFonts w:ascii="Times New Roman" w:eastAsia="Times New Roman" w:hAnsi="Times New Roman" w:cs="Times New Roman"/>
+          <w:b/>
+          <w:bCs/>
+          <w:kern w:val="0"/>
+          <w14:ligatures w14:val="none"/>
+        </w:rPr>
+        <w:t>Course Site</w:t>
+      </w:r>
+      <w:r>
+        <w:rPr>
+          <w:rFonts w:ascii="Times New Roman" w:eastAsia="Times New Roman" w:hAnsi="Times New Roman" w:cs="Times New Roman"/>
+          <w:b/>
+          <w:bCs/>
+          <w:kern w:val="0"/>
+          <w14:ligatures w14:val="none"/>
+        </w:rPr>
+        <w:t>s</w:t>
+      </w:r>
+      <w:r>
+        <w:rPr>
+          <w:rFonts w:ascii="Times New Roman" w:eastAsia="Times New Roman" w:hAnsi="Times New Roman" w:cs="Times New Roman"/>
+          <w:b/>
+          <w:bCs/>
+          <w:kern w:val="0"/>
+          <w14:ligatures w14:val="none"/>
+        </w:rPr>
+        <w:t>:</w:t>
+      </w:r>
+      <w:r>
+        <w:rPr>
+          <w:rFonts w:ascii="Times New Roman" w:eastAsia="Times New Roman" w:hAnsi="Times New Roman" w:cs="Times New Roman"/>
+          <w:kern w:val="0"/>
+          <w14:ligatures w14:val="none"/>
+        </w:rPr>
+        <w:t xml:space="preserve"> </w:t>
+      </w:r>
+    </w:p>
+    <w:p>
+      <w:pPr>
+        <w:pStyle w:val="ListParagraph"/>
+        <w:numPr>
+          <w:ilvl w:val="0"/>
+          <w:numId w:val="24"/>
+        </w:numPr>
+        <w:spacing w:before="100" w:beforeAutospacing="1" w:after="100" w:afterAutospacing="1" w:line="240" w:lineRule="auto"/>
+        <w:rPr>
+          <w:rFonts w:ascii="Times New Roman" w:eastAsia="Times New Roman" w:hAnsi="Times New Roman" w:cs="Times New Roman"/>
+          <w:kern w:val="0"/>
+          <w14:ligatures w14:val="none"/>
+        </w:rPr>
+      </w:pPr>
+      <w:r>
+        <w:rPr>
+          <w:rFonts w:ascii="Times New Roman" w:eastAsia="Times New Roman" w:hAnsi="Times New Roman" w:cs="Times New Roman"/>
+          <w:kern w:val="0"/>
+          <w14:ligatures w14:val="none"/>
+        </w:rPr>
+        <w:t>Rutgers Canvas (announcements, submissions,</w:t>
+      </w:r>
+      <w:r>
+        <w:rPr>
+          <w:rFonts w:ascii="Times New Roman" w:eastAsia="Times New Roman" w:hAnsi="Times New Roman" w:cs="Times New Roman"/>
+          <w:kern w:val="0"/>
+          <w14:ligatures w14:val="none"/>
+        </w:rPr>
+        <w:t xml:space="preserve"> discussions, and</w:t>
+      </w:r>
+      <w:r>
+        <w:rPr>
+          <w:rFonts w:ascii="Times New Roman" w:eastAsia="Times New Roman" w:hAnsi="Times New Roman" w:cs="Times New Roman"/>
+          <w:kern w:val="0"/>
+          <w14:ligatures w14:val="none"/>
+        </w:rPr>
+        <w:t xml:space="preserve"> grades):</w:t>
+      </w:r>
+      <w:r>
+        <w:t xml:space="preserve"> </w:t>
+      </w:r>
+      <w:r>
+        <w:rPr>
+          <w:rFonts w:ascii="Times New Roman" w:eastAsia="Times New Roman" w:hAnsi="Times New Roman" w:cs="Times New Roman"/>
+          <w:kern w:val="0"/>
+          <w14:ligatures w14:val="none"/>
+        </w:rPr>
+        <w:t xml:space="preserve">  </w:t>
+      </w:r>
+      <w:hyperlink r:id="rId11" w:history="1">
+        <w:r>
+          <w:rPr>
+            <w:rStyle w:val="Hyperlink"/>
+            <w:rFonts w:ascii="Times New Roman" w:eastAsia="Times New Roman" w:hAnsi="Times New Roman" w:cs="Times New Roman"/>
+            <w:kern w:val="0"/>
+            <w14:ligatures w14:val="none"/>
+          </w:rPr>
+          <w:t>https://rutgers.instructure.com/courses/385339</w:t>
+        </w:r>
+      </w:hyperlink>
+      <w:r>
+        <w:rPr>
+          <w:rFonts w:ascii="Times New Roman" w:eastAsia="Times New Roman" w:hAnsi="Times New Roman" w:cs="Times New Roman"/>
+          <w:kern w:val="0"/>
+          <w14:ligatures w14:val="none"/>
+        </w:rPr>
+        <w:t xml:space="preserve">   </w:t>
+      </w:r>
+    </w:p>
+    <w:p>
+      <w:pPr>
+        <w:pStyle w:val="ListParagraph"/>
+        <w:numPr>
+          <w:ilvl w:val="0"/>
+          <w:numId w:val="24"/>
+        </w:numPr>
+        <w:spacing w:before="100" w:beforeAutospacing="1" w:after="100" w:afterAutospacing="1" w:line="240" w:lineRule="auto"/>
+        <w:rPr>
+          <w:rFonts w:ascii="Times New Roman" w:eastAsia="Times New Roman" w:hAnsi="Times New Roman" w:cs="Times New Roman"/>
+          <w:kern w:val="0"/>
+          <w14:ligatures w14:val="none"/>
+        </w:rPr>
+      </w:pPr>
+      <w:r>
+        <w:rPr>
+          <w:rFonts w:ascii="Times New Roman" w:eastAsia="Times New Roman" w:hAnsi="Times New Roman" w:cs="Times New Roman"/>
+          <w:kern w:val="0"/>
+          <w14:ligatures w14:val="none"/>
+        </w:rPr>
+        <w:t xml:space="preserve">GitHub for </w:t>
+      </w:r>
+      <w:r>
+        <w:rPr>
+          <w:rFonts w:ascii="Times New Roman" w:eastAsia="Times New Roman" w:hAnsi="Times New Roman" w:cs="Times New Roman"/>
+          <w:kern w:val="0"/>
+          <w14:ligatures w14:val="none"/>
+        </w:rPr>
+        <w:t>weekly materials (lecture content, project and assignment materials):</w:t>
+      </w:r>
+    </w:p>
+    <w:p>
+      <w:pPr>
+        <w:pStyle w:val="ListParagraph"/>
+        <w:spacing w:before="100" w:beforeAutospacing="1" w:after="100" w:afterAutospacing="1" w:line="240" w:lineRule="auto"/>
+        <w:rPr>
+          <w:rFonts w:ascii="Times New Roman" w:eastAsia="Times New Roman" w:hAnsi="Times New Roman" w:cs="Times New Roman"/>
+          <w:kern w:val="0"/>
+          <w14:ligatures w14:val="none"/>
+        </w:rPr>
+      </w:pPr>
+      <w:hyperlink r:id="rId12" w:history="1">
+        <w:r>
+          <w:rPr>
+            <w:rStyle w:val="Hyperlink"/>
+            <w:rFonts w:ascii="Times New Roman" w:eastAsia="Times New Roman" w:hAnsi="Times New Roman" w:cs="Times New Roman"/>
+            <w:kern w:val="0"/>
+            <w14:ligatures w14:val="none"/>
+          </w:rPr>
+          <w:t>https://github.com/AI-Enabled-Informatics-for-Engineers/ISE</w:t>
+        </w:r>
+      </w:hyperlink>
     </w:p>
     <w:p>
       <w:pPr>
@@ -390,7 +838,25 @@
           <w:kern w:val="0"/>
           <w14:ligatures w14:val="none"/>
         </w:rPr>
-        <w:t xml:space="preserve"> and via a milestone-based real world project</w:t>
+        <w:t xml:space="preserve"> and via a milestone-based </w:t>
+      </w:r>
+      <w:proofErr w:type="gramStart"/>
+      <w:r>
+        <w:rPr>
+          <w:rFonts w:ascii="Times New Roman" w:eastAsia="Times New Roman" w:hAnsi="Times New Roman" w:cs="Times New Roman"/>
+          <w:kern w:val="0"/>
+          <w14:ligatures w14:val="none"/>
+        </w:rPr>
+        <w:t>real world</w:t>
+      </w:r>
+      <w:proofErr w:type="gramEnd"/>
+      <w:r>
+        <w:rPr>
+          <w:rFonts w:ascii="Times New Roman" w:eastAsia="Times New Roman" w:hAnsi="Times New Roman" w:cs="Times New Roman"/>
+          <w:kern w:val="0"/>
+          <w14:ligatures w14:val="none"/>
+        </w:rPr>
+        <w:t xml:space="preserve"> project</w:t>
       </w:r>
       <w:r>
         <w:rPr>
@@ -551,6 +1017,7 @@
           <w:kern w:val="0"/>
           <w14:ligatures w14:val="none"/>
         </w:rPr>
+        <w:lastRenderedPageBreak/>
         <w:t>Use cloud tools (Rutgers-supported Azure/AWS access) for a minimal working prototype.</w:t>
       </w:r>
     </w:p>
@@ -642,7 +1109,6 @@
           <w:szCs w:val="48"/>
           <w14:ligatures w14:val="none"/>
         </w:rPr>
-        <w:lastRenderedPageBreak/>
         <w:t>3) Prerequisites / Readiness</w:t>
       </w:r>
     </w:p>
@@ -749,7 +1215,7 @@
         </w:rPr>
         <w:t xml:space="preserve">Kaggle Learn: Python </w:t>
       </w:r>
-      <w:hyperlink r:id="rId6" w:tgtFrame="_new" w:history="1">
+      <w:hyperlink r:id="rId13" w:tgtFrame="_new" w:history="1">
         <w:r>
           <w:rPr>
             <w:rFonts w:ascii="Times New Roman" w:eastAsia="Times New Roman" w:hAnsi="Times New Roman" w:cs="Times New Roman"/>
@@ -783,7 +1249,7 @@
         </w:rPr>
         <w:t xml:space="preserve">Khan Academy: Statistics &amp; probability </w:t>
       </w:r>
-      <w:hyperlink r:id="rId7" w:tgtFrame="_new" w:history="1">
+      <w:hyperlink r:id="rId14" w:tgtFrame="_new" w:history="1">
         <w:r>
           <w:rPr>
             <w:rFonts w:ascii="Times New Roman" w:eastAsia="Times New Roman" w:hAnsi="Times New Roman" w:cs="Times New Roman"/>
@@ -990,7 +1456,7 @@
         </w:rPr>
         <w:t xml:space="preserve">“Informatics” foundational framing (definition/overview): </w:t>
       </w:r>
-      <w:hyperlink r:id="rId8" w:tgtFrame="_new" w:history="1">
+      <w:hyperlink r:id="rId15" w:tgtFrame="_new" w:history="1">
         <w:r>
           <w:rPr>
             <w:rFonts w:ascii="Times New Roman" w:eastAsia="Times New Roman" w:hAnsi="Times New Roman" w:cs="Times New Roman"/>
@@ -1050,7 +1516,7 @@
         </w:rPr>
         <w:br/>
       </w:r>
-      <w:hyperlink r:id="rId9" w:tgtFrame="_new" w:history="1">
+      <w:hyperlink r:id="rId16" w:tgtFrame="_new" w:history="1">
         <w:r>
           <w:rPr>
             <w:rFonts w:ascii="Times New Roman" w:eastAsia="Times New Roman" w:hAnsi="Times New Roman" w:cs="Times New Roman"/>
@@ -1117,9 +1583,10 @@
           <w:kern w:val="0"/>
           <w14:ligatures w14:val="none"/>
         </w:rPr>
+        <w:lastRenderedPageBreak/>
         <w:t xml:space="preserve">European Commission: Industry 5.0 overview </w:t>
       </w:r>
-      <w:hyperlink r:id="rId10" w:tgtFrame="_new" w:history="1">
+      <w:hyperlink r:id="rId17" w:tgtFrame="_new" w:history="1">
         <w:r>
           <w:rPr>
             <w:rFonts w:ascii="Times New Roman" w:eastAsia="Times New Roman" w:hAnsi="Times New Roman" w:cs="Times New Roman"/>
@@ -1161,7 +1628,7 @@
         </w:rPr>
         <w:t xml:space="preserve">EC publication hub (deeper reading) </w:t>
       </w:r>
-      <w:hyperlink r:id="rId11" w:tgtFrame="_new" w:history="1">
+      <w:hyperlink r:id="rId18" w:tgtFrame="_new" w:history="1">
         <w:r>
           <w:rPr>
             <w:rFonts w:ascii="Times New Roman" w:eastAsia="Times New Roman" w:hAnsi="Times New Roman" w:cs="Times New Roman"/>
@@ -1206,7 +1673,6 @@
           <w:szCs w:val="36"/>
           <w14:ligatures w14:val="none"/>
         </w:rPr>
-        <w:lastRenderedPageBreak/>
         <w:t>Responsible AI + Security (Required later in term)</w:t>
       </w:r>
     </w:p>
@@ -1231,7 +1697,7 @@
         </w:rPr>
         <w:t xml:space="preserve">NIST AI RMF landing page: </w:t>
       </w:r>
-      <w:hyperlink r:id="rId12" w:tgtFrame="_new" w:history="1">
+      <w:hyperlink r:id="rId19" w:tgtFrame="_new" w:history="1">
         <w:r>
           <w:rPr>
             <w:rFonts w:ascii="Times New Roman" w:eastAsia="Times New Roman" w:hAnsi="Times New Roman" w:cs="Times New Roman"/>
@@ -1273,7 +1739,7 @@
         </w:rPr>
         <w:t xml:space="preserve">NIST AI RMF PDF: </w:t>
       </w:r>
-      <w:hyperlink r:id="rId13" w:tgtFrame="_new" w:history="1">
+      <w:hyperlink r:id="rId20" w:tgtFrame="_new" w:history="1">
         <w:r>
           <w:rPr>
             <w:rFonts w:ascii="Times New Roman" w:eastAsia="Times New Roman" w:hAnsi="Times New Roman" w:cs="Times New Roman"/>
@@ -1315,7 +1781,7 @@
         </w:rPr>
         <w:t xml:space="preserve">OWASP Top 10 for LLM Apps: </w:t>
       </w:r>
-      <w:hyperlink r:id="rId14" w:tgtFrame="_new" w:history="1">
+      <w:hyperlink r:id="rId21" w:tgtFrame="_new" w:history="1">
         <w:r>
           <w:rPr>
             <w:rFonts w:ascii="Times New Roman" w:eastAsia="Times New Roman" w:hAnsi="Times New Roman" w:cs="Times New Roman"/>
@@ -1349,7 +1815,7 @@
         </w:rPr>
         <w:t xml:space="preserve">Crypto 101 (free practical crypto intro): </w:t>
       </w:r>
-      <w:hyperlink r:id="rId15" w:tgtFrame="_new" w:history="1">
+      <w:hyperlink r:id="rId22" w:tgtFrame="_new" w:history="1">
         <w:r>
           <w:rPr>
             <w:rFonts w:ascii="Times New Roman" w:eastAsia="Times New Roman" w:hAnsi="Times New Roman" w:cs="Times New Roman"/>
@@ -1369,7 +1835,7 @@
         </w:rPr>
         <w:t xml:space="preserve"> (PDF: </w:t>
       </w:r>
-      <w:hyperlink r:id="rId16" w:tgtFrame="_new" w:history="1">
+      <w:hyperlink r:id="rId23" w:tgtFrame="_new" w:history="1">
         <w:r>
           <w:rPr>
             <w:rFonts w:ascii="Times New Roman" w:eastAsia="Times New Roman" w:hAnsi="Times New Roman" w:cs="Times New Roman"/>
@@ -1411,7 +1877,7 @@
         </w:rPr>
         <w:t xml:space="preserve">NIST Key Management (conceptual anchor): </w:t>
       </w:r>
-      <w:hyperlink r:id="rId17" w:tgtFrame="_new" w:history="1">
+      <w:hyperlink r:id="rId24" w:tgtFrame="_new" w:history="1">
         <w:r>
           <w:rPr>
             <w:rFonts w:ascii="Times New Roman" w:eastAsia="Times New Roman" w:hAnsi="Times New Roman" w:cs="Times New Roman"/>
@@ -1519,7 +1985,7 @@
         </w:rPr>
         <w:t xml:space="preserve">Rutgers Cloud Services overview: </w:t>
       </w:r>
-      <w:hyperlink r:id="rId18" w:tgtFrame="_new" w:history="1">
+      <w:hyperlink r:id="rId25" w:tgtFrame="_new" w:history="1">
         <w:r>
           <w:rPr>
             <w:rFonts w:ascii="Times New Roman" w:eastAsia="Times New Roman" w:hAnsi="Times New Roman" w:cs="Times New Roman"/>
@@ -1561,7 +2027,7 @@
         </w:rPr>
         <w:t xml:space="preserve">Rutgers Cloud Services support (who to email if access is unclear): </w:t>
       </w:r>
-      <w:hyperlink r:id="rId19" w:tgtFrame="_new" w:history="1">
+      <w:hyperlink r:id="rId26" w:tgtFrame="_new" w:history="1">
         <w:r>
           <w:rPr>
             <w:rFonts w:ascii="Times New Roman" w:eastAsia="Times New Roman" w:hAnsi="Times New Roman" w:cs="Times New Roman"/>
@@ -1612,7 +2078,7 @@
         <w:br/>
         <w:t xml:space="preserve">University software portal listing: </w:t>
       </w:r>
-      <w:hyperlink r:id="rId20" w:tgtFrame="_new" w:history="1">
+      <w:hyperlink r:id="rId27" w:tgtFrame="_new" w:history="1">
         <w:r>
           <w:rPr>
             <w:rFonts w:ascii="Times New Roman" w:eastAsia="Times New Roman" w:hAnsi="Times New Roman" w:cs="Times New Roman"/>
@@ -1641,7 +2107,7 @@
         <w:br/>
         <w:t xml:space="preserve">Public software catalog entry point: </w:t>
       </w:r>
-      <w:hyperlink r:id="rId21" w:tgtFrame="_new" w:history="1">
+      <w:hyperlink r:id="rId28" w:tgtFrame="_new" w:history="1">
         <w:r>
           <w:rPr>
             <w:rFonts w:ascii="Times New Roman" w:eastAsia="Times New Roman" w:hAnsi="Times New Roman" w:cs="Times New Roman"/>
@@ -1794,13 +2260,29 @@
         </w:rPr>
         <w:t xml:space="preserve">/ or </w:t>
       </w:r>
-      <w:hyperlink r:id="rId22" w:history="1">
+      <w:hyperlink r:id="rId29" w:history="1">
         <w:r>
           <w:rPr>
             <w:color w:val="0000FF"/>
             <w:u w:val="single"/>
           </w:rPr>
-          <w:t xml:space="preserve">Welcome To </w:t>
+          <w:t xml:space="preserve">Welcome </w:t>
+        </w:r>
+        <w:proofErr w:type="gramStart"/>
+        <w:r>
+          <w:rPr>
+            <w:color w:val="0000FF"/>
+            <w:u w:val="single"/>
+          </w:rPr>
+          <w:t>To</w:t>
+        </w:r>
+        <w:proofErr w:type="gramEnd"/>
+        <w:r>
+          <w:rPr>
+            <w:color w:val="0000FF"/>
+            <w:u w:val="single"/>
+          </w:rPr>
+          <w:t xml:space="preserve"> </w:t>
         </w:r>
         <w:proofErr w:type="spellStart"/>
         <w:r>
@@ -1901,7 +2383,7 @@
         </w:rPr>
         <w:t xml:space="preserve">Microsoft Azure for Students: </w:t>
       </w:r>
-      <w:hyperlink r:id="rId23" w:tgtFrame="_new" w:history="1">
+      <w:hyperlink r:id="rId30" w:tgtFrame="_new" w:history="1">
         <w:r>
           <w:rPr>
             <w:rFonts w:ascii="Times New Roman" w:eastAsia="Times New Roman" w:hAnsi="Times New Roman" w:cs="Times New Roman"/>
@@ -1988,6 +2470,7 @@
           <w:kern w:val="0"/>
           <w14:ligatures w14:val="none"/>
         </w:rPr>
+        <w:lastRenderedPageBreak/>
         <w:t>Two common routes students can use:</w:t>
       </w:r>
     </w:p>
@@ -2012,7 +2495,7 @@
         </w:rPr>
         <w:t xml:space="preserve">AWS Educate (no-cost learning/labs): </w:t>
       </w:r>
-      <w:hyperlink r:id="rId24" w:tgtFrame="_new" w:history="1">
+      <w:hyperlink r:id="rId31" w:tgtFrame="_new" w:history="1">
         <w:r>
           <w:rPr>
             <w:rFonts w:ascii="Times New Roman" w:eastAsia="Times New Roman" w:hAnsi="Times New Roman" w:cs="Times New Roman"/>
@@ -2080,7 +2563,7 @@
         </w:rPr>
         <w:br/>
       </w:r>
-      <w:hyperlink r:id="rId25" w:tgtFrame="_new" w:history="1">
+      <w:hyperlink r:id="rId32" w:tgtFrame="_new" w:history="1">
         <w:r>
           <w:rPr>
             <w:rFonts w:ascii="Times New Roman" w:eastAsia="Times New Roman" w:hAnsi="Times New Roman" w:cs="Times New Roman"/>
@@ -2267,24 +2750,6 @@
           <w:kern w:val="0"/>
           <w14:ligatures w14:val="none"/>
         </w:rPr>
-        <w:t xml:space="preserve"> + </w:t>
-      </w:r>
-      <w:r>
-        <w:rPr>
-          <w:rFonts w:ascii="Times New Roman" w:eastAsia="Times New Roman" w:hAnsi="Times New Roman" w:cs="Times New Roman"/>
-          <w:b/>
-          <w:bCs/>
-          <w:kern w:val="0"/>
-          <w14:ligatures w14:val="none"/>
-        </w:rPr>
-        <w:t>demo clip</w:t>
-      </w:r>
-      <w:r>
-        <w:rPr>
-          <w:rFonts w:ascii="Times New Roman" w:eastAsia="Times New Roman" w:hAnsi="Times New Roman" w:cs="Times New Roman"/>
-          <w:kern w:val="0"/>
-          <w14:ligatures w14:val="none"/>
-        </w:rPr>
         <w:t xml:space="preserve"> </w:t>
       </w:r>
     </w:p>
@@ -2317,7 +2782,15 @@
           <w:kern w:val="0"/>
           <w14:ligatures w14:val="none"/>
         </w:rPr>
-        <w:t xml:space="preserve"> (short, grounded in a tool/source)</w:t>
+        <w:t xml:space="preserve"> (</w:t>
+      </w:r>
+      <w:r>
+        <w:rPr>
+          <w:rFonts w:ascii="Times New Roman" w:eastAsia="Times New Roman" w:hAnsi="Times New Roman" w:cs="Times New Roman"/>
+          <w:kern w:val="0"/>
+          <w14:ligatures w14:val="none"/>
+        </w:rPr>
+        <w:t>students post in Canvas, respond to classmates during TA sessions on Thursday)</w:t>
       </w:r>
     </w:p>
     <w:p>
@@ -2341,7 +2814,27 @@
           <w:kern w:val="0"/>
           <w14:ligatures w14:val="none"/>
         </w:rPr>
-        <w:t>Project milestone (selected weeks)</w:t>
+        <w:t>Project milestone (selected weeks</w:t>
+      </w:r>
+      <w:r>
+        <w:rPr>
+          <w:rFonts w:ascii="Times New Roman" w:eastAsia="Times New Roman" w:hAnsi="Times New Roman" w:cs="Times New Roman"/>
+          <w:b/>
+          <w:bCs/>
+          <w:kern w:val="0"/>
+          <w14:ligatures w14:val="none"/>
+        </w:rPr>
+        <w:t>; see below and appendix</w:t>
+      </w:r>
+      <w:r>
+        <w:rPr>
+          <w:rFonts w:ascii="Times New Roman" w:eastAsia="Times New Roman" w:hAnsi="Times New Roman" w:cs="Times New Roman"/>
+          <w:b/>
+          <w:bCs/>
+          <w:kern w:val="0"/>
+          <w14:ligatures w14:val="none"/>
+        </w:rPr>
+        <w:t>)</w:t>
       </w:r>
     </w:p>
     <w:p>
@@ -2452,7 +2945,27 @@
           <w:kern w:val="0"/>
           <w14:ligatures w14:val="none"/>
         </w:rPr>
-        <w:t>10%</w:t>
+        <w:t>10</w:t>
+      </w:r>
+      <w:r>
+        <w:rPr>
+          <w:rFonts w:ascii="Times New Roman" w:eastAsia="Times New Roman" w:hAnsi="Times New Roman" w:cs="Times New Roman"/>
+          <w:b/>
+          <w:bCs/>
+          <w:kern w:val="0"/>
+          <w14:ligatures w14:val="none"/>
+        </w:rPr>
+        <w:t>%</w:t>
+      </w:r>
+      <w:r>
+        <w:rPr>
+          <w:rFonts w:ascii="Times New Roman" w:eastAsia="Times New Roman" w:hAnsi="Times New Roman" w:cs="Times New Roman"/>
+          <w:b/>
+          <w:bCs/>
+          <w:kern w:val="0"/>
+          <w14:ligatures w14:val="none"/>
+        </w:rPr>
+        <w:t xml:space="preserve"> </w:t>
       </w:r>
     </w:p>
     <w:p>
@@ -2484,7 +2997,59 @@
           <w:kern w:val="0"/>
           <w14:ligatures w14:val="none"/>
         </w:rPr>
-        <w:t>30%</w:t>
+        <w:t>30</w:t>
+      </w:r>
+      <w:proofErr w:type="gramStart"/>
+      <w:r>
+        <w:rPr>
+          <w:rFonts w:ascii="Times New Roman" w:eastAsia="Times New Roman" w:hAnsi="Times New Roman" w:cs="Times New Roman"/>
+          <w:b/>
+          <w:bCs/>
+          <w:kern w:val="0"/>
+          <w14:ligatures w14:val="none"/>
+        </w:rPr>
+        <w:t>%</w:t>
+      </w:r>
+      <w:r>
+        <w:rPr>
+          <w:rFonts w:ascii="Times New Roman" w:eastAsia="Times New Roman" w:hAnsi="Times New Roman" w:cs="Times New Roman"/>
+          <w:kern w:val="0"/>
+          <w14:ligatures w14:val="none"/>
+        </w:rPr>
+        <w:t xml:space="preserve">  (</w:t>
+      </w:r>
+      <w:proofErr w:type="gramEnd"/>
+      <w:r>
+        <w:rPr>
+          <w:rFonts w:ascii="Times New Roman" w:eastAsia="Times New Roman" w:hAnsi="Times New Roman" w:cs="Times New Roman"/>
+          <w:b/>
+          <w:bCs/>
+          <w:kern w:val="0"/>
+          <w14:ligatures w14:val="none"/>
+        </w:rPr>
+        <w:t xml:space="preserve">See details in Appendix A and </w:t>
+      </w:r>
+      <w:proofErr w:type="spellStart"/>
+      <w:r>
+        <w:rPr>
+          <w:rFonts w:ascii="Times New Roman" w:eastAsia="Times New Roman" w:hAnsi="Times New Roman" w:cs="Times New Roman"/>
+          <w:b/>
+          <w:bCs/>
+          <w:kern w:val="0"/>
+          <w14:ligatures w14:val="none"/>
+        </w:rPr>
+        <w:t>Github</w:t>
+      </w:r>
+      <w:proofErr w:type="spellEnd"/>
+      <w:r>
+        <w:rPr>
+          <w:rFonts w:ascii="Times New Roman" w:eastAsia="Times New Roman" w:hAnsi="Times New Roman" w:cs="Times New Roman"/>
+          <w:b/>
+          <w:bCs/>
+          <w:kern w:val="0"/>
+          <w14:ligatures w14:val="none"/>
+        </w:rPr>
+        <w:t>)</w:t>
       </w:r>
     </w:p>
     <w:p>
@@ -2548,7 +3113,53 @@
           <w:kern w:val="0"/>
           <w14:ligatures w14:val="none"/>
         </w:rPr>
-        <w:t>30%</w:t>
+        <w:t>30</w:t>
+      </w:r>
+      <w:proofErr w:type="gramStart"/>
+      <w:r>
+        <w:rPr>
+          <w:rFonts w:ascii="Times New Roman" w:eastAsia="Times New Roman" w:hAnsi="Times New Roman" w:cs="Times New Roman"/>
+          <w:b/>
+          <w:bCs/>
+          <w:kern w:val="0"/>
+          <w14:ligatures w14:val="none"/>
+        </w:rPr>
+        <w:t>%</w:t>
+      </w:r>
+      <w:r>
+        <w:rPr>
+          <w:rFonts w:ascii="Times New Roman" w:eastAsia="Times New Roman" w:hAnsi="Times New Roman" w:cs="Times New Roman"/>
+          <w:kern w:val="0"/>
+          <w14:ligatures w14:val="none"/>
+        </w:rPr>
+        <w:t xml:space="preserve">  (</w:t>
+      </w:r>
+      <w:proofErr w:type="gramEnd"/>
+      <w:r>
+        <w:rPr>
+          <w:rFonts w:ascii="Times New Roman" w:eastAsia="Times New Roman" w:hAnsi="Times New Roman" w:cs="Times New Roman"/>
+          <w:kern w:val="0"/>
+          <w14:ligatures w14:val="none"/>
+        </w:rPr>
+        <w:t xml:space="preserve">See details in Appendix B and </w:t>
+      </w:r>
+      <w:proofErr w:type="spellStart"/>
+      <w:r>
+        <w:rPr>
+          <w:rFonts w:ascii="Times New Roman" w:eastAsia="Times New Roman" w:hAnsi="Times New Roman" w:cs="Times New Roman"/>
+          <w:kern w:val="0"/>
+          <w14:ligatures w14:val="none"/>
+        </w:rPr>
+        <w:t>Github</w:t>
+      </w:r>
+      <w:proofErr w:type="spellEnd"/>
+      <w:r>
+        <w:rPr>
+          <w:rFonts w:ascii="Times New Roman" w:eastAsia="Times New Roman" w:hAnsi="Times New Roman" w:cs="Times New Roman"/>
+          <w:kern w:val="0"/>
+          <w14:ligatures w14:val="none"/>
+        </w:rPr>
+        <w:t>)</w:t>
       </w:r>
     </w:p>
     <w:p>
@@ -2633,34 +3244,6 @@
     <w:p>
       <w:pPr>
         <w:spacing w:before="100" w:beforeAutospacing="1" w:after="100" w:afterAutospacing="1" w:line="240" w:lineRule="auto"/>
-        <w:rPr>
-          <w:rFonts w:ascii="Times New Roman" w:eastAsia="Times New Roman" w:hAnsi="Times New Roman" w:cs="Times New Roman"/>
-          <w:kern w:val="0"/>
-          <w14:ligatures w14:val="none"/>
-        </w:rPr>
-      </w:pPr>
-      <w:r>
-        <w:rPr>
-          <w:rFonts w:ascii="Times New Roman" w:eastAsia="Times New Roman" w:hAnsi="Times New Roman" w:cs="Times New Roman"/>
-          <w:b/>
-          <w:bCs/>
-          <w:kern w:val="0"/>
-          <w14:ligatures w14:val="none"/>
-        </w:rPr>
-        <w:t>Primary text chapter mapping is explicit</w:t>
-      </w:r>
-      <w:r>
-        <w:rPr>
-          <w:rFonts w:ascii="Times New Roman" w:eastAsia="Times New Roman" w:hAnsi="Times New Roman" w:cs="Times New Roman"/>
-          <w:kern w:val="0"/>
-          <w14:ligatures w14:val="none"/>
-        </w:rPr>
-        <w:t xml:space="preserve"> (based on the published TOC). </w:t>
-      </w:r>
-    </w:p>
-    <w:p>
-      <w:pPr>
-        <w:spacing w:before="100" w:beforeAutospacing="1" w:after="100" w:afterAutospacing="1" w:line="240" w:lineRule="auto"/>
         <w:outlineLvl w:val="2"/>
         <w:rPr>
           <w:rFonts w:ascii="Times New Roman" w:eastAsia="Times New Roman" w:hAnsi="Times New Roman" w:cs="Times New Roman"/>
@@ -2768,9 +3351,10 @@
           <w:kern w:val="0"/>
           <w14:ligatures w14:val="none"/>
         </w:rPr>
+        <w:lastRenderedPageBreak/>
         <w:t xml:space="preserve">NCBI Informatics overview: </w:t>
       </w:r>
-      <w:hyperlink r:id="rId26" w:tgtFrame="_new" w:history="1">
+      <w:hyperlink r:id="rId33" w:tgtFrame="_new" w:history="1">
         <w:r>
           <w:rPr>
             <w:rFonts w:ascii="Times New Roman" w:eastAsia="Times New Roman" w:hAnsi="Times New Roman" w:cs="Times New Roman"/>
@@ -2812,7 +3396,7 @@
         </w:rPr>
         <w:t xml:space="preserve">Edinburgh “What is Informatics?”: </w:t>
       </w:r>
-      <w:hyperlink r:id="rId27" w:tgtFrame="_new" w:history="1">
+      <w:hyperlink r:id="rId34" w:tgtFrame="_new" w:history="1">
         <w:r>
           <w:rPr>
             <w:rFonts w:ascii="Times New Roman" w:eastAsia="Times New Roman" w:hAnsi="Times New Roman" w:cs="Times New Roman"/>
@@ -2858,7 +3442,7 @@
         </w:rPr>
         <w:t xml:space="preserve"> </w:t>
       </w:r>
-      <w:hyperlink r:id="rId28" w:tgtFrame="_new" w:history="1">
+      <w:hyperlink r:id="rId35" w:tgtFrame="_new" w:history="1">
         <w:r>
           <w:rPr>
             <w:rFonts w:ascii="Times New Roman" w:eastAsia="Times New Roman" w:hAnsi="Times New Roman" w:cs="Times New Roman"/>
@@ -2867,18 +3451,7 @@
             <w:u w:val="single"/>
             <w14:ligatures w14:val="none"/>
           </w:rPr>
-          <w:t>https://research-and-innovation.ec.europa.eu/research-</w:t>
-        </w:r>
-        <w:r>
-          <w:rPr>
-            <w:rFonts w:ascii="Times New Roman" w:eastAsia="Times New Roman" w:hAnsi="Times New Roman" w:cs="Times New Roman"/>
-            <w:color w:val="0000FF"/>
-            <w:kern w:val="0"/>
-            <w:u w:val="single"/>
-            <w14:ligatures w14:val="none"/>
-          </w:rPr>
-          <w:lastRenderedPageBreak/>
-          <w:t>area/industrial-research-and-innovation/industry-50_en</w:t>
+          <w:t>https://research-and-innovation.ec.europa.eu/research-area/industrial-research-and-innovation/industry-50_en</w:t>
         </w:r>
       </w:hyperlink>
       <w:r>
@@ -3118,7 +3691,7 @@
         </w:rPr>
         <w:t xml:space="preserve"> </w:t>
       </w:r>
-      <w:hyperlink r:id="rId29" w:tgtFrame="_new" w:history="1">
+      <w:hyperlink r:id="rId36" w:tgtFrame="_new" w:history="1">
         <w:r>
           <w:rPr>
             <w:rFonts w:ascii="Times New Roman" w:eastAsia="Times New Roman" w:hAnsi="Times New Roman" w:cs="Times New Roman"/>
@@ -3152,7 +3725,7 @@
         </w:rPr>
         <w:t xml:space="preserve">Kaggle Intro to SQL </w:t>
       </w:r>
-      <w:hyperlink r:id="rId30" w:tgtFrame="_new" w:history="1">
+      <w:hyperlink r:id="rId37" w:tgtFrame="_new" w:history="1">
         <w:r>
           <w:rPr>
             <w:rFonts w:ascii="Times New Roman" w:eastAsia="Times New Roman" w:hAnsi="Times New Roman" w:cs="Times New Roman"/>
@@ -3386,7 +3959,7 @@
         </w:rPr>
         <w:t xml:space="preserve"> Prefect docs </w:t>
       </w:r>
-      <w:hyperlink r:id="rId31" w:tgtFrame="_new" w:history="1">
+      <w:hyperlink r:id="rId38" w:tgtFrame="_new" w:history="1">
         <w:r>
           <w:rPr>
             <w:rFonts w:ascii="Times New Roman" w:eastAsia="Times New Roman" w:hAnsi="Times New Roman" w:cs="Times New Roman"/>
@@ -3569,7 +4142,7 @@
         </w:rPr>
         <w:t xml:space="preserve"> NIST AI RMF (overview) </w:t>
       </w:r>
-      <w:hyperlink r:id="rId32" w:tgtFrame="_new" w:history="1">
+      <w:hyperlink r:id="rId39" w:tgtFrame="_new" w:history="1">
         <w:r>
           <w:rPr>
             <w:rFonts w:ascii="Times New Roman" w:eastAsia="Times New Roman" w:hAnsi="Times New Roman" w:cs="Times New Roman"/>
@@ -3672,6 +4245,7 @@
           <w:kern w:val="0"/>
           <w14:ligatures w14:val="none"/>
         </w:rPr>
+        <w:lastRenderedPageBreak/>
         <w:t xml:space="preserve"> </w:t>
       </w:r>
       <w:r>
@@ -3737,7 +4311,6 @@
           <w:szCs w:val="27"/>
           <w14:ligatures w14:val="none"/>
         </w:rPr>
-        <w:lastRenderedPageBreak/>
         <w:t>Week 5 (Feb 17–23) — Prompting as interface + human-centered informatics (Industry 5.0 revisited)</w:t>
       </w:r>
     </w:p>
@@ -3812,7 +4385,7 @@
         </w:rPr>
         <w:t xml:space="preserve"> </w:t>
       </w:r>
-      <w:hyperlink r:id="rId33" w:tgtFrame="_new" w:history="1">
+      <w:hyperlink r:id="rId40" w:tgtFrame="_new" w:history="1">
         <w:r>
           <w:rPr>
             <w:rFonts w:ascii="Times New Roman" w:eastAsia="Times New Roman" w:hAnsi="Times New Roman" w:cs="Times New Roman"/>
@@ -4017,7 +4590,7 @@
         </w:rPr>
         <w:t xml:space="preserve">NASA C-MAPSS (official) </w:t>
       </w:r>
-      <w:hyperlink r:id="rId34" w:tgtFrame="_new" w:history="1">
+      <w:hyperlink r:id="rId41" w:tgtFrame="_new" w:history="1">
         <w:r>
           <w:rPr>
             <w:rFonts w:ascii="Times New Roman" w:eastAsia="Times New Roman" w:hAnsi="Times New Roman" w:cs="Times New Roman"/>
@@ -4391,6 +4964,7 @@
           <w:szCs w:val="27"/>
           <w14:ligatures w14:val="none"/>
         </w:rPr>
+        <w:lastRenderedPageBreak/>
         <w:t>Week 8 (Mar 24–30) — Midterm (asynchronous) + architecture checkpoint</w:t>
       </w:r>
     </w:p>
@@ -4411,7 +4985,6 @@
           <w:kern w:val="0"/>
           <w14:ligatures w14:val="none"/>
         </w:rPr>
-        <w:lastRenderedPageBreak/>
         <w:t>Primary text:</w:t>
       </w:r>
       <w:r>
@@ -4672,7 +5245,7 @@
         </w:rPr>
         <w:t xml:space="preserve">Chroma </w:t>
       </w:r>
-      <w:hyperlink r:id="rId35" w:tgtFrame="_new" w:history="1">
+      <w:hyperlink r:id="rId42" w:tgtFrame="_new" w:history="1">
         <w:r>
           <w:rPr>
             <w:rFonts w:ascii="Times New Roman" w:eastAsia="Times New Roman" w:hAnsi="Times New Roman" w:cs="Times New Roman"/>
@@ -4714,7 +5287,7 @@
         </w:rPr>
         <w:t xml:space="preserve">FAISS </w:t>
       </w:r>
-      <w:hyperlink r:id="rId36" w:tgtFrame="_new" w:history="1">
+      <w:hyperlink r:id="rId43" w:tgtFrame="_new" w:history="1">
         <w:r>
           <w:rPr>
             <w:rFonts w:ascii="Times New Roman" w:eastAsia="Times New Roman" w:hAnsi="Times New Roman" w:cs="Times New Roman"/>
@@ -4919,7 +5492,7 @@
         </w:rPr>
         <w:t xml:space="preserve">OpenAI Cookbook </w:t>
       </w:r>
-      <w:hyperlink r:id="rId37" w:tgtFrame="_new" w:history="1">
+      <w:hyperlink r:id="rId44" w:tgtFrame="_new" w:history="1">
         <w:r>
           <w:rPr>
             <w:rFonts w:ascii="Times New Roman" w:eastAsia="Times New Roman" w:hAnsi="Times New Roman" w:cs="Times New Roman"/>
@@ -4961,7 +5534,7 @@
         </w:rPr>
         <w:t xml:space="preserve">RAG explainer </w:t>
       </w:r>
-      <w:hyperlink r:id="rId38" w:tgtFrame="_new" w:history="1">
+      <w:hyperlink r:id="rId45" w:tgtFrame="_new" w:history="1">
         <w:r>
           <w:rPr>
             <w:rFonts w:ascii="Times New Roman" w:eastAsia="Times New Roman" w:hAnsi="Times New Roman" w:cs="Times New Roman"/>
@@ -5013,7 +5586,7 @@
         </w:rPr>
         <w:t xml:space="preserve"> docs </w:t>
       </w:r>
-      <w:hyperlink r:id="rId39" w:tgtFrame="_new" w:history="1">
+      <w:hyperlink r:id="rId46" w:tgtFrame="_new" w:history="1">
         <w:r>
           <w:rPr>
             <w:rFonts w:ascii="Times New Roman" w:eastAsia="Times New Roman" w:hAnsi="Times New Roman" w:cs="Times New Roman"/>
@@ -5235,6 +5808,7 @@
           <w:kern w:val="0"/>
           <w14:ligatures w14:val="none"/>
         </w:rPr>
+        <w:lastRenderedPageBreak/>
         <w:t>Primary text:</w:t>
       </w:r>
       <w:r>
@@ -5289,7 +5863,7 @@
         </w:rPr>
         <w:t xml:space="preserve"> OWASP LLM Top 10 </w:t>
       </w:r>
-      <w:hyperlink r:id="rId40" w:tgtFrame="_new" w:history="1">
+      <w:hyperlink r:id="rId47" w:tgtFrame="_new" w:history="1">
         <w:r>
           <w:rPr>
             <w:rFonts w:ascii="Times New Roman" w:eastAsia="Times New Roman" w:hAnsi="Times New Roman" w:cs="Times New Roman"/>
@@ -5298,18 +5872,7 @@
             <w:u w:val="single"/>
             <w14:ligatures w14:val="none"/>
           </w:rPr>
-          <w:t>https://owasp.org/www-project-top-10-for-</w:t>
-        </w:r>
-        <w:r>
-          <w:rPr>
-            <w:rFonts w:ascii="Times New Roman" w:eastAsia="Times New Roman" w:hAnsi="Times New Roman" w:cs="Times New Roman"/>
-            <w:color w:val="0000FF"/>
-            <w:kern w:val="0"/>
-            <w:u w:val="single"/>
-            <w14:ligatures w14:val="none"/>
-          </w:rPr>
-          <w:lastRenderedPageBreak/>
-          <w:t>large-language-model-applications/</w:t>
+          <w:t>https://owasp.org/www-project-top-10-for-large-language-model-applications/</w:t>
         </w:r>
       </w:hyperlink>
       <w:r>
@@ -5483,7 +6046,7 @@
         </w:rPr>
         <w:t xml:space="preserve"> </w:t>
       </w:r>
-      <w:hyperlink r:id="rId41" w:tgtFrame="_new" w:history="1">
+      <w:hyperlink r:id="rId48" w:tgtFrame="_new" w:history="1">
         <w:r>
           <w:rPr>
             <w:rFonts w:ascii="Times New Roman" w:eastAsia="Times New Roman" w:hAnsi="Times New Roman" w:cs="Times New Roman"/>
@@ -5704,7 +6267,7 @@
         </w:rPr>
         <w:t xml:space="preserve">NIST AI RMF </w:t>
       </w:r>
-      <w:hyperlink r:id="rId42" w:tgtFrame="_new" w:history="1">
+      <w:hyperlink r:id="rId49" w:tgtFrame="_new" w:history="1">
         <w:r>
           <w:rPr>
             <w:rFonts w:ascii="Times New Roman" w:eastAsia="Times New Roman" w:hAnsi="Times New Roman" w:cs="Times New Roman"/>
@@ -5746,7 +6309,7 @@
         </w:rPr>
         <w:t xml:space="preserve">OWASP LLM Top 10 </w:t>
       </w:r>
-      <w:hyperlink r:id="rId43" w:tgtFrame="_new" w:history="1">
+      <w:hyperlink r:id="rId50" w:tgtFrame="_new" w:history="1">
         <w:r>
           <w:rPr>
             <w:rFonts w:ascii="Times New Roman" w:eastAsia="Times New Roman" w:hAnsi="Times New Roman" w:cs="Times New Roman"/>
@@ -5780,7 +6343,7 @@
         </w:rPr>
         <w:t xml:space="preserve">Crypto 101 </w:t>
       </w:r>
-      <w:hyperlink r:id="rId44" w:tgtFrame="_new" w:history="1">
+      <w:hyperlink r:id="rId51" w:tgtFrame="_new" w:history="1">
         <w:r>
           <w:rPr>
             <w:rFonts w:ascii="Times New Roman" w:eastAsia="Times New Roman" w:hAnsi="Times New Roman" w:cs="Times New Roman"/>
@@ -5814,7 +6377,7 @@
         </w:rPr>
         <w:t xml:space="preserve">NIST SP 800-57 Pt 1 Rev 5 </w:t>
       </w:r>
-      <w:hyperlink r:id="rId45" w:tgtFrame="_new" w:history="1">
+      <w:hyperlink r:id="rId52" w:tgtFrame="_new" w:history="1">
         <w:r>
           <w:rPr>
             <w:rFonts w:ascii="Times New Roman" w:eastAsia="Times New Roman" w:hAnsi="Times New Roman" w:cs="Times New Roman"/>
@@ -6397,7 +6960,7 @@
         </w:rPr>
         <w:t xml:space="preserve">): </w:t>
       </w:r>
-      <w:hyperlink r:id="rId46" w:tgtFrame="_new" w:history="1">
+      <w:hyperlink r:id="rId53" w:tgtFrame="_new" w:history="1">
         <w:r>
           <w:rPr>
             <w:rFonts w:ascii="Times New Roman" w:eastAsia="Times New Roman" w:hAnsi="Times New Roman" w:cs="Times New Roman"/>
@@ -6431,7 +6994,7 @@
         </w:rPr>
         <w:t xml:space="preserve">CICIDS2017 (cyber): </w:t>
       </w:r>
-      <w:hyperlink r:id="rId47" w:tgtFrame="_new" w:history="1">
+      <w:hyperlink r:id="rId54" w:tgtFrame="_new" w:history="1">
         <w:r>
           <w:rPr>
             <w:rFonts w:ascii="Times New Roman" w:eastAsia="Times New Roman" w:hAnsi="Times New Roman" w:cs="Times New Roman"/>
@@ -6465,7 +7028,7 @@
         </w:rPr>
         <w:t xml:space="preserve">UCI Diabetes (healthcare—if chosen): </w:t>
       </w:r>
-      <w:hyperlink r:id="rId48" w:tgtFrame="_new" w:history="1">
+      <w:hyperlink r:id="rId55" w:tgtFrame="_new" w:history="1">
         <w:r>
           <w:rPr>
             <w:rFonts w:ascii="Times New Roman" w:eastAsia="Times New Roman" w:hAnsi="Times New Roman" w:cs="Times New Roman"/>
@@ -6499,7 +7062,7 @@
         </w:rPr>
         <w:t xml:space="preserve">PJM energy consumption: </w:t>
       </w:r>
-      <w:hyperlink r:id="rId49" w:tgtFrame="_new" w:history="1">
+      <w:hyperlink r:id="rId56" w:tgtFrame="_new" w:history="1">
         <w:r>
           <w:rPr>
             <w:rFonts w:ascii="Times New Roman" w:eastAsia="Times New Roman" w:hAnsi="Times New Roman" w:cs="Times New Roman"/>
@@ -6584,7 +7147,7 @@
         </w:rPr>
         <w:br/>
       </w:r>
-      <w:hyperlink r:id="rId50" w:tgtFrame="_new" w:history="1">
+      <w:hyperlink r:id="rId57" w:tgtFrame="_new" w:history="1">
         <w:r>
           <w:rPr>
             <w:rFonts w:ascii="Times New Roman" w:eastAsia="Times New Roman" w:hAnsi="Times New Roman" w:cs="Times New Roman"/>
@@ -6802,7 +7365,7 @@
         </w:rPr>
         <w:t xml:space="preserve"> </w:t>
       </w:r>
-      <w:hyperlink r:id="rId51" w:tgtFrame="_new" w:history="1">
+      <w:hyperlink r:id="rId58" w:tgtFrame="_new" w:history="1">
         <w:r>
           <w:rPr>
             <w:rFonts w:ascii="Times New Roman" w:eastAsia="Times New Roman" w:hAnsi="Times New Roman" w:cs="Times New Roman"/>
@@ -6848,7 +7411,7 @@
         </w:rPr>
         <w:br/>
       </w:r>
-      <w:hyperlink r:id="rId52" w:tgtFrame="_new" w:history="1">
+      <w:hyperlink r:id="rId59" w:tgtFrame="_new" w:history="1">
         <w:r>
           <w:rPr>
             <w:rFonts w:ascii="Times New Roman" w:eastAsia="Times New Roman" w:hAnsi="Times New Roman" w:cs="Times New Roman"/>
@@ -6896,7 +7459,7 @@
         </w:rPr>
         <w:br/>
       </w:r>
-      <w:hyperlink r:id="rId53" w:tgtFrame="_new" w:history="1">
+      <w:hyperlink r:id="rId60" w:tgtFrame="_new" w:history="1">
         <w:r>
           <w:rPr>
             <w:rFonts w:ascii="Times New Roman" w:eastAsia="Times New Roman" w:hAnsi="Times New Roman" w:cs="Times New Roman"/>
@@ -6975,7 +7538,15 @@
     </w:p>
     <w:p>
       <w:r>
-        <w:t>• Queries must run. If using Colab, include output cells.</w:t>
+        <w:t xml:space="preserve">• Queries must run. If using Colab, </w:t>
+      </w:r>
+      <w:proofErr w:type="gramStart"/>
+      <w:r>
+        <w:t>include</w:t>
+      </w:r>
+      <w:proofErr w:type="gramEnd"/>
+      <w:r>
+        <w:t xml:space="preserve"> output cells.</w:t>
       </w:r>
     </w:p>
     <w:p>
@@ -7030,8 +7601,13 @@
             <w:tcW w:w="2340" w:type="dxa"/>
           </w:tcPr>
           <w:p>
-            <w:r>
-              <w:t>Exceeds Expectations (A-range)</w:t>
+            <w:proofErr w:type="gramStart"/>
+            <w:r>
+              <w:t>Exceeds</w:t>
+            </w:r>
+            <w:proofErr w:type="gramEnd"/>
+            <w:r>
+              <w:t xml:space="preserve"> Expectations (A-range)</w:t>
             </w:r>
           </w:p>
         </w:tc>
@@ -7073,7 +7649,15 @@
           </w:tcPr>
           <w:p>
             <w:r>
-              <w:t>Each question supports a specific action by a named decision-maker; includes what changes based on the answer.</w:t>
+              <w:t xml:space="preserve">Each question supports a specific action by a named decision-maker; includes what changes </w:t>
+            </w:r>
+            <w:proofErr w:type="gramStart"/>
+            <w:r>
+              <w:t>based</w:t>
+            </w:r>
+            <w:proofErr w:type="gramEnd"/>
+            <w:r>
+              <w:t xml:space="preserve"> on the answer.</w:t>
             </w:r>
           </w:p>
         </w:tc>
@@ -7253,7 +7837,15 @@
     </w:p>
     <w:p>
       <w:r>
-        <w:t>• 1–2 page memo (PDF) describing: decision, error types, cost model, evaluation metrics, and an evaluation plan.</w:t>
+        <w:t>• 1–</w:t>
+      </w:r>
+      <w:proofErr w:type="gramStart"/>
+      <w:r>
+        <w:t>2 page</w:t>
+      </w:r>
+      <w:proofErr w:type="gramEnd"/>
+      <w:r>
+        <w:t xml:space="preserve"> memo (PDF) describing: decision, error types, cost model, evaluation metrics, and an evaluation plan.</w:t>
       </w:r>
     </w:p>
     <w:p>
@@ -7326,8 +7918,13 @@
             <w:tcW w:w="2340" w:type="dxa"/>
           </w:tcPr>
           <w:p>
-            <w:r>
-              <w:t>Exceeds Expectations (A-range)</w:t>
+            <w:proofErr w:type="gramStart"/>
+            <w:r>
+              <w:t>Exceeds</w:t>
+            </w:r>
+            <w:proofErr w:type="gramEnd"/>
+            <w:r>
+              <w:t xml:space="preserve"> Expectations (A-range)</w:t>
             </w:r>
           </w:p>
         </w:tc>
@@ -7400,8 +7997,13 @@
             <w:tcW w:w="2340" w:type="dxa"/>
           </w:tcPr>
           <w:p>
-            <w:r>
-              <w:t xml:space="preserve">Uses at least one metric beyond </w:t>
+            <w:proofErr w:type="gramStart"/>
+            <w:r>
+              <w:t>Uses</w:t>
+            </w:r>
+            <w:proofErr w:type="gramEnd"/>
+            <w:r>
+              <w:t xml:space="preserve"> at least one metric beyond </w:t>
             </w:r>
             <w:r>
               <w:lastRenderedPageBreak/>
@@ -7505,7 +8107,15 @@
           </w:tcPr>
           <w:p>
             <w:r>
-              <w:t>Multiple credible citations; assumptions clearly labeled.</w:t>
+              <w:t xml:space="preserve">Multiple credible </w:t>
+            </w:r>
+            <w:proofErr w:type="gramStart"/>
+            <w:r>
+              <w:t>citations;</w:t>
+            </w:r>
+            <w:proofErr w:type="gramEnd"/>
+            <w:r>
+              <w:t xml:space="preserve"> assumptions clearly labeled.</w:t>
             </w:r>
           </w:p>
         </w:tc>
@@ -7548,7 +8158,15 @@
     </w:p>
     <w:p>
       <w:r>
-        <w:t>• A runnable notebook (Colab link or .ipynb) demonstrating data → output end-to-end.</w:t>
+        <w:t xml:space="preserve">• A runnable notebook (Colab link </w:t>
+      </w:r>
+      <w:proofErr w:type="gramStart"/>
+      <w:r>
+        <w:t>or .ipynb</w:t>
+      </w:r>
+      <w:proofErr w:type="gramEnd"/>
+      <w:r>
+        <w:t>) demonstrating data → output end-to-end.</w:t>
       </w:r>
     </w:p>
     <w:p>
@@ -7621,8 +8239,13 @@
             <w:tcW w:w="2340" w:type="dxa"/>
           </w:tcPr>
           <w:p>
-            <w:r>
-              <w:t>Exceeds Expectations (A-range)</w:t>
+            <w:proofErr w:type="gramStart"/>
+            <w:r>
+              <w:t>Exceeds</w:t>
+            </w:r>
+            <w:proofErr w:type="gramEnd"/>
+            <w:r>
+              <w:t xml:space="preserve"> Expectations (A-range)</w:t>
             </w:r>
           </w:p>
         </w:tc>
@@ -7912,8 +8535,13 @@
             <w:tcW w:w="2340" w:type="dxa"/>
           </w:tcPr>
           <w:p>
-            <w:r>
-              <w:t>Exceeds Expectations (A-range)</w:t>
+            <w:proofErr w:type="gramStart"/>
+            <w:r>
+              <w:t>Exceeds</w:t>
+            </w:r>
+            <w:proofErr w:type="gramEnd"/>
+            <w:r>
+              <w:t xml:space="preserve"> Expectations (A-range)</w:t>
             </w:r>
           </w:p>
         </w:tc>
@@ -8139,7 +8767,15 @@
     </w:p>
     <w:p>
       <w:r>
-        <w:t>• A short notebook or PDF with: causal question, assumptions, simple estimate attempt, and decision interpretation.</w:t>
+        <w:t xml:space="preserve">• A short notebook or PDF </w:t>
+      </w:r>
+      <w:proofErr w:type="gramStart"/>
+      <w:r>
+        <w:t>with:</w:t>
+      </w:r>
+      <w:proofErr w:type="gramEnd"/>
+      <w:r>
+        <w:t xml:space="preserve"> causal question, assumptions, simple estimate attempt, and decision interpretation.</w:t>
       </w:r>
     </w:p>
     <w:p>
@@ -8207,8 +8843,13 @@
             <w:tcW w:w="2340" w:type="dxa"/>
           </w:tcPr>
           <w:p>
-            <w:r>
-              <w:t>Exceeds Expectations (A-range)</w:t>
+            <w:proofErr w:type="gramStart"/>
+            <w:r>
+              <w:t>Exceeds</w:t>
+            </w:r>
+            <w:proofErr w:type="gramEnd"/>
+            <w:r>
+              <w:t xml:space="preserve"> Expectations (A-range)</w:t>
             </w:r>
           </w:p>
         </w:tc>
@@ -8241,17 +8882,33 @@
           </w:tcPr>
           <w:p>
             <w:r>
-              <w:t>Causal question present but variables/confounders unclear.</w:t>
-            </w:r>
-          </w:p>
-        </w:tc>
-        <w:tc>
-          <w:tcPr>
-            <w:tcW w:w="2340" w:type="dxa"/>
-          </w:tcPr>
-          <w:p>
-            <w:r>
-              <w:t>Clear intervention logic; confounders identified and explained.</w:t>
+              <w:t xml:space="preserve">Causal </w:t>
+            </w:r>
+            <w:proofErr w:type="gramStart"/>
+            <w:r>
+              <w:t>question</w:t>
+            </w:r>
+            <w:proofErr w:type="gramEnd"/>
+            <w:r>
+              <w:t xml:space="preserve"> present but variables/confounders unclear.</w:t>
+            </w:r>
+          </w:p>
+        </w:tc>
+        <w:tc>
+          <w:tcPr>
+            <w:tcW w:w="2340" w:type="dxa"/>
+          </w:tcPr>
+          <w:p>
+            <w:r>
+              <w:t xml:space="preserve">Clear intervention </w:t>
+            </w:r>
+            <w:proofErr w:type="gramStart"/>
+            <w:r>
+              <w:t>logic;</w:t>
+            </w:r>
+            <w:proofErr w:type="gramEnd"/>
+            <w:r>
+              <w:t xml:space="preserve"> confounders identified and explained.</w:t>
             </w:r>
           </w:p>
         </w:tc>
@@ -8293,7 +8950,15 @@
           </w:tcPr>
           <w:p>
             <w:r>
-              <w:t>Explicit assumptions; realistic threats; suggests better data/design.</w:t>
+              <w:t xml:space="preserve">Explicit assumptions; realistic threats; </w:t>
+            </w:r>
+            <w:proofErr w:type="gramStart"/>
+            <w:r>
+              <w:t>suggests</w:t>
+            </w:r>
+            <w:proofErr w:type="gramEnd"/>
+            <w:r>
+              <w:t xml:space="preserve"> better data/design.</w:t>
             </w:r>
           </w:p>
         </w:tc>
@@ -8334,8 +8999,13 @@
             <w:tcW w:w="2340" w:type="dxa"/>
           </w:tcPr>
           <w:p>
-            <w:r>
-              <w:t>Explains what a decision-maker should do differently given estimate + uncertainty.</w:t>
+            <w:proofErr w:type="gramStart"/>
+            <w:r>
+              <w:t>Explains</w:t>
+            </w:r>
+            <w:proofErr w:type="gramEnd"/>
+            <w:r>
+              <w:t xml:space="preserve"> what a decision-maker should do differently given estimate + uncertainty.</w:t>
             </w:r>
           </w:p>
         </w:tc>
@@ -8413,7 +9083,15 @@
     </w:p>
     <w:p>
       <w:r>
-        <w:t>This appendix is the step-by-step project playbook. Each milestone includes deliverables, a checklist, a rubric, and credible resources.</w:t>
+        <w:t xml:space="preserve">This appendix is the step-by-step project playbook. Each milestone includes deliverables, a checklist, </w:t>
+      </w:r>
+      <w:proofErr w:type="gramStart"/>
+      <w:r>
+        <w:t>a rubric</w:t>
+      </w:r>
+      <w:proofErr w:type="gramEnd"/>
+      <w:r>
+        <w:t>, and credible resources.</w:t>
       </w:r>
     </w:p>
     <w:p>
@@ -8421,7 +9099,15 @@
         <w:pStyle w:val="Heading2"/>
       </w:pPr>
       <w:r>
-        <w:t>M0 - Week 1 (Ungraded) — Domain Shortlist</w:t>
+        <w:t>M0 - Week 1 (</w:t>
+      </w:r>
+      <w:proofErr w:type="gramStart"/>
+      <w:r>
+        <w:t>Ungraded) —</w:t>
+      </w:r>
+      <w:proofErr w:type="gramEnd"/>
+      <w:r>
+        <w:t xml:space="preserve"> Domain Shortlist</w:t>
       </w:r>
     </w:p>
     <w:p>
@@ -8580,7 +9266,15 @@
         <w:pStyle w:val="Heading2"/>
       </w:pPr>
       <w:r>
-        <w:t>M1 - Week 2 (Graded) — Problem Definition</w:t>
+        <w:t>M1 - Week 2 (</w:t>
+      </w:r>
+      <w:proofErr w:type="gramStart"/>
+      <w:r>
+        <w:t>Graded) —</w:t>
+      </w:r>
+      <w:proofErr w:type="gramEnd"/>
+      <w:r>
+        <w:t xml:space="preserve"> Problem Definition</w:t>
       </w:r>
     </w:p>
     <w:p>
@@ -8720,17 +9414,33 @@
           </w:tcPr>
           <w:p>
             <w:r>
-              <w:t>Decision mostly clear.</w:t>
-            </w:r>
-          </w:p>
-        </w:tc>
-        <w:tc>
-          <w:tcPr>
-            <w:tcW w:w="2340" w:type="dxa"/>
-          </w:tcPr>
-          <w:p>
-            <w:r>
-              <w:t>Decision is crisp, action-oriented, includes stakeholder and context.</w:t>
+              <w:t xml:space="preserve">Decision </w:t>
+            </w:r>
+            <w:proofErr w:type="gramStart"/>
+            <w:r>
+              <w:t>mostly</w:t>
+            </w:r>
+            <w:proofErr w:type="gramEnd"/>
+            <w:r>
+              <w:t xml:space="preserve"> clear.</w:t>
+            </w:r>
+          </w:p>
+        </w:tc>
+        <w:tc>
+          <w:tcPr>
+            <w:tcW w:w="2340" w:type="dxa"/>
+          </w:tcPr>
+          <w:p>
+            <w:r>
+              <w:t xml:space="preserve">Decision is crisp, action-oriented, </w:t>
+            </w:r>
+            <w:proofErr w:type="gramStart"/>
+            <w:r>
+              <w:t>includes</w:t>
+            </w:r>
+            <w:proofErr w:type="gramEnd"/>
+            <w:r>
+              <w:t xml:space="preserve"> stakeholder and context.</w:t>
             </w:r>
           </w:p>
         </w:tc>
@@ -8881,7 +9591,15 @@
         <w:pStyle w:val="Heading2"/>
       </w:pPr>
       <w:r>
-        <w:t>M2 - Week 4 (Graded) — Pipeline + Schema + Evaluation Plan</w:t>
+        <w:t>M2 - Week 4 (</w:t>
+      </w:r>
+      <w:proofErr w:type="gramStart"/>
+      <w:r>
+        <w:t>Graded) —</w:t>
+      </w:r>
+      <w:proofErr w:type="gramEnd"/>
+      <w:r>
+        <w:t xml:space="preserve"> Pipeline + Schema + Evaluation Plan</w:t>
       </w:r>
     </w:p>
     <w:p>
@@ -9183,7 +9901,15 @@
       </w:pPr>
       <w:r>
         <w:lastRenderedPageBreak/>
-        <w:t>M3 - Week 6 (Graded) — MVP Demo Checkpoint</w:t>
+        <w:t>M3 - Week 6 (</w:t>
+      </w:r>
+      <w:proofErr w:type="gramStart"/>
+      <w:r>
+        <w:t>Graded) —</w:t>
+      </w:r>
+      <w:proofErr w:type="gramEnd"/>
+      <w:r>
+        <w:t xml:space="preserve"> MVP Demo Checkpoint</w:t>
       </w:r>
     </w:p>
     <w:p>
@@ -9206,7 +9932,15 @@
     </w:p>
     <w:p>
       <w:r>
-        <w:t>• 2–4 minute walkthrough video OR notebook walkthrough section</w:t>
+        <w:t>• 2–</w:t>
+      </w:r>
+      <w:proofErr w:type="gramStart"/>
+      <w:r>
+        <w:t>4 minute</w:t>
+      </w:r>
+      <w:proofErr w:type="gramEnd"/>
+      <w:r>
+        <w:t xml:space="preserve"> walkthrough video OR notebook walkthrough section</w:t>
       </w:r>
     </w:p>
     <w:p>
@@ -9484,7 +10218,15 @@
       </w:pPr>
       <w:r>
         <w:lastRenderedPageBreak/>
-        <w:t>M4 - Week 8 (Graded) — Architecture Packet (Midterm)</w:t>
+        <w:t>M4 - Week 8 (</w:t>
+      </w:r>
+      <w:proofErr w:type="gramStart"/>
+      <w:r>
+        <w:t>Graded) —</w:t>
+      </w:r>
+      <w:proofErr w:type="gramEnd"/>
+      <w:r>
+        <w:t xml:space="preserve"> Architecture Packet (Midterm)</w:t>
       </w:r>
     </w:p>
     <w:p>
@@ -9525,7 +10267,15 @@
     </w:p>
     <w:p>
       <w:r>
-        <w:t>• Diagram includes: data, pipeline, storage, model/retrieval, decision UI, monitoring.</w:t>
+        <w:t xml:space="preserve">• Diagram </w:t>
+      </w:r>
+      <w:proofErr w:type="gramStart"/>
+      <w:r>
+        <w:t>includes:</w:t>
+      </w:r>
+      <w:proofErr w:type="gramEnd"/>
+      <w:r>
+        <w:t xml:space="preserve"> data, pipeline, storage, model/retrieval, decision UI, monitoring.</w:t>
       </w:r>
     </w:p>
     <w:p>
@@ -9737,7 +10487,15 @@
         <w:pStyle w:val="Heading2"/>
       </w:pPr>
       <w:r>
-        <w:t>M5 - Week 10 (Graded) — Advanced Capability</w:t>
+        <w:t>M5 - Week 10 (</w:t>
+      </w:r>
+      <w:proofErr w:type="gramStart"/>
+      <w:r>
+        <w:t>Graded) —</w:t>
+      </w:r>
+      <w:proofErr w:type="gramEnd"/>
+      <w:r>
+        <w:t xml:space="preserve"> Advanced Capability</w:t>
       </w:r>
     </w:p>
     <w:p>
@@ -9986,7 +10744,15 @@
         <w:pStyle w:val="Heading2"/>
       </w:pPr>
       <w:r>
-        <w:t>M6 - Week 13 (Graded) — Trust/Security Package</w:t>
+        <w:t>M6 - Week 13 (</w:t>
+      </w:r>
+      <w:proofErr w:type="gramStart"/>
+      <w:r>
+        <w:t>Graded) —</w:t>
+      </w:r>
+      <w:proofErr w:type="gramEnd"/>
+      <w:r>
+        <w:t xml:space="preserve"> Trust/Security Package</w:t>
       </w:r>
     </w:p>
     <w:p>
@@ -10033,7 +10799,15 @@
     </w:p>
     <w:p>
       <w:r>
-        <w:t>• At least 5 mitigations mapped to threats.</w:t>
+        <w:t xml:space="preserve">• At least 5 mitigations </w:t>
+      </w:r>
+      <w:proofErr w:type="gramStart"/>
+      <w:r>
+        <w:t>mapped</w:t>
+      </w:r>
+      <w:proofErr w:type="gramEnd"/>
+      <w:r>
+        <w:t xml:space="preserve"> to threats.</w:t>
       </w:r>
     </w:p>
     <w:p>
@@ -10250,7 +11024,15 @@
         <w:pStyle w:val="Heading2"/>
       </w:pPr>
       <w:r>
-        <w:t>M7 - Week 14 (Final) — Final Delivery</w:t>
+        <w:t>M7 - Week 14 (</w:t>
+      </w:r>
+      <w:proofErr w:type="gramStart"/>
+      <w:r>
+        <w:t>Final) —</w:t>
+      </w:r>
+      <w:proofErr w:type="gramEnd"/>
+      <w:r>
+        <w:t xml:space="preserve"> Final Delivery</w:t>
       </w:r>
     </w:p>
     <w:p>
@@ -10302,7 +11084,15 @@
     </w:p>
     <w:p>
       <w:r>
-        <w:t>• You state next steps if you had 4 more weeks.</w:t>
+        <w:t xml:space="preserve">• You state next steps if you </w:t>
+      </w:r>
+      <w:proofErr w:type="gramStart"/>
+      <w:r>
+        <w:t>had</w:t>
+      </w:r>
+      <w:proofErr w:type="gramEnd"/>
+      <w:r>
+        <w:t xml:space="preserve"> 4 more weeks.</w:t>
       </w:r>
     </w:p>
     <w:tbl>
@@ -10395,7 +11185,23 @@
           </w:tcPr>
           <w:p>
             <w:r>
-              <w:t>Compelling, specific, decision-focused.</w:t>
+              <w:t xml:space="preserve">Compelling, </w:t>
+            </w:r>
+            <w:proofErr w:type="gramStart"/>
+            <w:r>
+              <w:t>specific</w:t>
+            </w:r>
+            <w:proofErr w:type="gramEnd"/>
+            <w:r>
+              <w:t xml:space="preserve">, </w:t>
+            </w:r>
+            <w:proofErr w:type="gramStart"/>
+            <w:r>
+              <w:t>decision-focused</w:t>
+            </w:r>
+            <w:proofErr w:type="gramEnd"/>
+            <w:r>
+              <w:t>.</w:t>
             </w:r>
           </w:p>
         </w:tc>
@@ -10583,7 +11389,717 @@
       </w:r>
     </w:p>
     <w:p/>
+    <w:p/>
+    <w:p/>
+    <w:p/>
+    <w:p/>
+    <w:p>
+      <w:pPr>
+        <w:keepNext/>
+        <w:keepLines/>
+        <w:spacing w:before="360" w:after="80"/>
+        <w:outlineLvl w:val="0"/>
+        <w:rPr>
+          <w:rFonts w:asciiTheme="majorHAnsi" w:eastAsiaTheme="majorEastAsia" w:hAnsiTheme="majorHAnsi" w:cstheme="majorBidi"/>
+          <w:color w:val="0F4761" w:themeColor="accent1" w:themeShade="BF"/>
+          <w:sz w:val="40"/>
+          <w:szCs w:val="40"/>
+        </w:rPr>
+      </w:pPr>
+      <w:r>
+        <w:rPr>
+          <w:rFonts w:asciiTheme="majorHAnsi" w:eastAsiaTheme="majorEastAsia" w:hAnsiTheme="majorHAnsi" w:cstheme="majorBidi"/>
+          <w:color w:val="0F4761" w:themeColor="accent1" w:themeShade="BF"/>
+          <w:sz w:val="40"/>
+          <w:szCs w:val="40"/>
+        </w:rPr>
+        <w:lastRenderedPageBreak/>
+        <w:t xml:space="preserve">Appendix </w:t>
+      </w:r>
+      <w:r>
+        <w:rPr>
+          <w:rFonts w:asciiTheme="majorHAnsi" w:eastAsiaTheme="majorEastAsia" w:hAnsiTheme="majorHAnsi" w:cstheme="majorBidi"/>
+          <w:color w:val="0F4761" w:themeColor="accent1" w:themeShade="BF"/>
+          <w:sz w:val="40"/>
+          <w:szCs w:val="40"/>
+        </w:rPr>
+        <w:t>C</w:t>
+      </w:r>
+      <w:r>
+        <w:rPr>
+          <w:rFonts w:asciiTheme="majorHAnsi" w:eastAsiaTheme="majorEastAsia" w:hAnsiTheme="majorHAnsi" w:cstheme="majorBidi"/>
+          <w:color w:val="0F4761" w:themeColor="accent1" w:themeShade="BF"/>
+          <w:sz w:val="40"/>
+          <w:szCs w:val="40"/>
+        </w:rPr>
+        <w:t xml:space="preserve"> </w:t>
+      </w:r>
+      <w:r>
+        <w:rPr>
+          <w:rFonts w:asciiTheme="majorHAnsi" w:eastAsiaTheme="majorEastAsia" w:hAnsiTheme="majorHAnsi" w:cstheme="majorBidi"/>
+          <w:color w:val="0F4761" w:themeColor="accent1" w:themeShade="BF"/>
+          <w:sz w:val="40"/>
+          <w:szCs w:val="40"/>
+        </w:rPr>
+        <w:t>–</w:t>
+      </w:r>
+      <w:r>
+        <w:rPr>
+          <w:rFonts w:asciiTheme="majorHAnsi" w:eastAsiaTheme="majorEastAsia" w:hAnsiTheme="majorHAnsi" w:cstheme="majorBidi"/>
+          <w:color w:val="0F4761" w:themeColor="accent1" w:themeShade="BF"/>
+          <w:sz w:val="40"/>
+          <w:szCs w:val="40"/>
+        </w:rPr>
+        <w:t xml:space="preserve"> </w:t>
+      </w:r>
+      <w:r>
+        <w:rPr>
+          <w:rFonts w:asciiTheme="majorHAnsi" w:eastAsiaTheme="majorEastAsia" w:hAnsiTheme="majorHAnsi" w:cstheme="majorBidi"/>
+          <w:color w:val="0F4761" w:themeColor="accent1" w:themeShade="BF"/>
+          <w:sz w:val="40"/>
+          <w:szCs w:val="40"/>
+        </w:rPr>
+        <w:t>ZOOM Dial-in Information</w:t>
+      </w:r>
+    </w:p>
+    <w:p>
+      <w:pPr>
+        <w:keepNext/>
+        <w:keepLines/>
+        <w:spacing w:before="360" w:after="80"/>
+        <w:outlineLvl w:val="0"/>
+        <w:rPr>
+          <w:rFonts w:asciiTheme="majorHAnsi" w:eastAsiaTheme="majorEastAsia" w:hAnsiTheme="majorHAnsi" w:cstheme="majorBidi"/>
+          <w:color w:val="0F4761" w:themeColor="accent1" w:themeShade="BF"/>
+          <w:sz w:val="40"/>
+          <w:szCs w:val="40"/>
+        </w:rPr>
+      </w:pPr>
+      <w:r>
+        <w:rPr>
+          <w:rFonts w:asciiTheme="majorHAnsi" w:eastAsiaTheme="majorEastAsia" w:hAnsiTheme="majorHAnsi" w:cstheme="majorBidi"/>
+          <w:color w:val="0F4761" w:themeColor="accent1" w:themeShade="BF"/>
+          <w:sz w:val="40"/>
+          <w:szCs w:val="40"/>
+        </w:rPr>
+        <w:t>Weekly Lecture Recordings</w:t>
+      </w:r>
+    </w:p>
+    <w:p>
+      <w:pPr>
+        <w:keepNext/>
+        <w:keepLines/>
+        <w:spacing w:before="360" w:after="80"/>
+        <w:outlineLvl w:val="0"/>
+        <w:rPr>
+          <w:rFonts w:asciiTheme="majorHAnsi" w:eastAsiaTheme="majorEastAsia" w:hAnsiTheme="majorHAnsi" w:cstheme="majorBidi"/>
+          <w:color w:val="0F4761" w:themeColor="accent1" w:themeShade="BF"/>
+        </w:rPr>
+      </w:pPr>
+      <w:r>
+        <w:rPr>
+          <w:rFonts w:asciiTheme="majorHAnsi" w:eastAsiaTheme="majorEastAsia" w:hAnsiTheme="majorHAnsi" w:cstheme="majorBidi"/>
+          <w:color w:val="0F4761" w:themeColor="accent1" w:themeShade="BF"/>
+        </w:rPr>
+        <w:t xml:space="preserve">Topic: 2026SP </w:t>
+      </w:r>
+      <w:r>
+        <w:rPr>
+          <w:rFonts w:asciiTheme="majorHAnsi" w:eastAsiaTheme="majorEastAsia" w:hAnsiTheme="majorHAnsi" w:cstheme="majorBidi"/>
+          <w:color w:val="0F4761" w:themeColor="accent1" w:themeShade="BF"/>
+        </w:rPr>
+        <w:t xml:space="preserve">– </w:t>
+      </w:r>
+      <w:r>
+        <w:rPr>
+          <w:rFonts w:asciiTheme="majorHAnsi" w:eastAsiaTheme="majorEastAsia" w:hAnsiTheme="majorHAnsi" w:cstheme="majorBidi"/>
+          <w:color w:val="0F4761" w:themeColor="accent1" w:themeShade="BF"/>
+        </w:rPr>
+        <w:t>INDUS INFORMATICS (Lecture Recordings)</w:t>
+      </w:r>
+    </w:p>
+    <w:p>
+      <w:pPr>
+        <w:keepNext/>
+        <w:keepLines/>
+        <w:spacing w:before="360" w:after="80"/>
+        <w:outlineLvl w:val="0"/>
+        <w:rPr>
+          <w:rFonts w:asciiTheme="majorHAnsi" w:eastAsiaTheme="majorEastAsia" w:hAnsiTheme="majorHAnsi" w:cstheme="majorBidi"/>
+          <w:color w:val="0F4761" w:themeColor="accent1" w:themeShade="BF"/>
+        </w:rPr>
+      </w:pPr>
+      <w:r>
+        <w:rPr>
+          <w:rFonts w:asciiTheme="majorHAnsi" w:eastAsiaTheme="majorEastAsia" w:hAnsiTheme="majorHAnsi" w:cstheme="majorBidi"/>
+          <w:color w:val="0F4761" w:themeColor="accent1" w:themeShade="BF"/>
+        </w:rPr>
+        <w:t xml:space="preserve">Time: Jan 20, </w:t>
+      </w:r>
+      <w:proofErr w:type="gramStart"/>
+      <w:r>
+        <w:rPr>
+          <w:rFonts w:asciiTheme="majorHAnsi" w:eastAsiaTheme="majorEastAsia" w:hAnsiTheme="majorHAnsi" w:cstheme="majorBidi"/>
+          <w:color w:val="0F4761" w:themeColor="accent1" w:themeShade="BF"/>
+        </w:rPr>
+        <w:t>2026</w:t>
+      </w:r>
+      <w:proofErr w:type="gramEnd"/>
+      <w:r>
+        <w:rPr>
+          <w:rFonts w:asciiTheme="majorHAnsi" w:eastAsiaTheme="majorEastAsia" w:hAnsiTheme="majorHAnsi" w:cstheme="majorBidi"/>
+          <w:color w:val="0F4761" w:themeColor="accent1" w:themeShade="BF"/>
+        </w:rPr>
+        <w:t xml:space="preserve"> 08:00 PM Eastern Time (US and Canada)</w:t>
+      </w:r>
+    </w:p>
+    <w:p>
+      <w:pPr>
+        <w:keepNext/>
+        <w:keepLines/>
+        <w:spacing w:before="360" w:after="80"/>
+        <w:outlineLvl w:val="0"/>
+        <w:rPr>
+          <w:rFonts w:asciiTheme="majorHAnsi" w:eastAsiaTheme="majorEastAsia" w:hAnsiTheme="majorHAnsi" w:cstheme="majorBidi"/>
+          <w:color w:val="0F4761" w:themeColor="accent1" w:themeShade="BF"/>
+        </w:rPr>
+      </w:pPr>
+      <w:r>
+        <w:rPr>
+          <w:rFonts w:asciiTheme="majorHAnsi" w:eastAsiaTheme="majorEastAsia" w:hAnsiTheme="majorHAnsi" w:cstheme="majorBidi"/>
+          <w:color w:val="0F4761" w:themeColor="accent1" w:themeShade="BF"/>
+        </w:rPr>
+        <w:t xml:space="preserve">        Every week on Tue</w:t>
+      </w:r>
+      <w:r>
+        <w:rPr>
+          <w:rFonts w:asciiTheme="majorHAnsi" w:eastAsiaTheme="majorEastAsia" w:hAnsiTheme="majorHAnsi" w:cstheme="majorBidi"/>
+          <w:color w:val="0F4761" w:themeColor="accent1" w:themeShade="BF"/>
+        </w:rPr>
+        <w:t xml:space="preserve"> at 8pm</w:t>
+      </w:r>
+      <w:r>
+        <w:rPr>
+          <w:rFonts w:asciiTheme="majorHAnsi" w:eastAsiaTheme="majorEastAsia" w:hAnsiTheme="majorHAnsi" w:cstheme="majorBidi"/>
+          <w:color w:val="0F4761" w:themeColor="accent1" w:themeShade="BF"/>
+        </w:rPr>
+        <w:t>, until May 12, 2026, 17 occurrence(s)</w:t>
+      </w:r>
+    </w:p>
+    <w:p>
+      <w:pPr>
+        <w:keepNext/>
+        <w:keepLines/>
+        <w:spacing w:before="360" w:after="80"/>
+        <w:outlineLvl w:val="0"/>
+        <w:rPr>
+          <w:rFonts w:asciiTheme="majorHAnsi" w:eastAsiaTheme="majorEastAsia" w:hAnsiTheme="majorHAnsi" w:cstheme="majorBidi"/>
+          <w:color w:val="0F4761" w:themeColor="accent1" w:themeShade="BF"/>
+        </w:rPr>
+      </w:pPr>
+      <w:r>
+        <w:rPr>
+          <w:rFonts w:asciiTheme="majorHAnsi" w:eastAsiaTheme="majorEastAsia" w:hAnsiTheme="majorHAnsi" w:cstheme="majorBidi"/>
+          <w:color w:val="0F4761" w:themeColor="accent1" w:themeShade="BF"/>
+        </w:rPr>
+        <w:t>Weekly: https://rutgers.zoom.us/meeting/tJUvf-6gpjgiHNZw718E1KFVYJ7aybqNEIL4/ics?icsToken=DCUs8R4a4XXkAaQx8AAALAAAAA4kx7M2Rwk_W-Vb_NsjI6JI84g_NgjdeP6n199qu3-TqcbQcmTfnLSfQE9nQANT7Ws-DgDHC1W7tskXBDAwMDAwMQ</w:t>
+      </w:r>
+    </w:p>
+    <w:p>
+      <w:pPr>
+        <w:keepNext/>
+        <w:keepLines/>
+        <w:spacing w:before="360" w:after="80"/>
+        <w:outlineLvl w:val="0"/>
+        <w:rPr>
+          <w:rFonts w:asciiTheme="majorHAnsi" w:eastAsiaTheme="majorEastAsia" w:hAnsiTheme="majorHAnsi" w:cstheme="majorBidi"/>
+          <w:color w:val="0F4761" w:themeColor="accent1" w:themeShade="BF"/>
+        </w:rPr>
+      </w:pPr>
+      <w:r>
+        <w:rPr>
+          <w:rFonts w:asciiTheme="majorHAnsi" w:eastAsiaTheme="majorEastAsia" w:hAnsiTheme="majorHAnsi" w:cstheme="majorBidi"/>
+          <w:color w:val="0F4761" w:themeColor="accent1" w:themeShade="BF"/>
+        </w:rPr>
+        <w:t>Join Zoom Meeting</w:t>
+      </w:r>
+    </w:p>
+    <w:p>
+      <w:pPr>
+        <w:keepNext/>
+        <w:keepLines/>
+        <w:spacing w:before="360" w:after="80"/>
+        <w:outlineLvl w:val="0"/>
+        <w:rPr>
+          <w:rFonts w:asciiTheme="majorHAnsi" w:eastAsiaTheme="majorEastAsia" w:hAnsiTheme="majorHAnsi" w:cstheme="majorBidi"/>
+          <w:color w:val="0F4761" w:themeColor="accent1" w:themeShade="BF"/>
+        </w:rPr>
+      </w:pPr>
+      <w:r>
+        <w:rPr>
+          <w:rFonts w:asciiTheme="majorHAnsi" w:eastAsiaTheme="majorEastAsia" w:hAnsiTheme="majorHAnsi" w:cstheme="majorBidi"/>
+          <w:color w:val="0F4761" w:themeColor="accent1" w:themeShade="BF"/>
+        </w:rPr>
+        <w:t>https://rutgers.zoom.us/j/91287883862?pwd=PiErrbHksviZpre1dVv4fu51PgaPhs.1</w:t>
+      </w:r>
+    </w:p>
+    <w:p>
+      <w:pPr>
+        <w:keepNext/>
+        <w:keepLines/>
+        <w:spacing w:before="360" w:after="80"/>
+        <w:outlineLvl w:val="0"/>
+        <w:rPr>
+          <w:rFonts w:asciiTheme="majorHAnsi" w:eastAsiaTheme="majorEastAsia" w:hAnsiTheme="majorHAnsi" w:cstheme="majorBidi"/>
+          <w:color w:val="0F4761" w:themeColor="accent1" w:themeShade="BF"/>
+        </w:rPr>
+      </w:pPr>
+      <w:r>
+        <w:rPr>
+          <w:rFonts w:asciiTheme="majorHAnsi" w:eastAsiaTheme="majorEastAsia" w:hAnsiTheme="majorHAnsi" w:cstheme="majorBidi"/>
+          <w:color w:val="0F4761" w:themeColor="accent1" w:themeShade="BF"/>
+        </w:rPr>
+        <w:t>Join by SIP</w:t>
+      </w:r>
+      <w:r>
+        <w:rPr>
+          <w:rFonts w:asciiTheme="majorHAnsi" w:eastAsiaTheme="majorEastAsia" w:hAnsiTheme="majorHAnsi" w:cstheme="majorBidi"/>
+          <w:color w:val="0F4761" w:themeColor="accent1" w:themeShade="BF"/>
+        </w:rPr>
+        <w:t xml:space="preserve"> </w:t>
+      </w:r>
+      <w:r>
+        <w:rPr>
+          <w:rFonts w:asciiTheme="majorHAnsi" w:eastAsiaTheme="majorEastAsia" w:hAnsiTheme="majorHAnsi" w:cstheme="majorBidi"/>
+          <w:color w:val="0F4761" w:themeColor="accent1" w:themeShade="BF"/>
+        </w:rPr>
+        <w:t>91287883862@zoomcrc.com</w:t>
+      </w:r>
+    </w:p>
+    <w:p>
+      <w:pPr>
+        <w:keepNext/>
+        <w:keepLines/>
+        <w:spacing w:before="360" w:after="80"/>
+        <w:outlineLvl w:val="0"/>
+        <w:rPr>
+          <w:rFonts w:asciiTheme="majorHAnsi" w:eastAsiaTheme="majorEastAsia" w:hAnsiTheme="majorHAnsi" w:cstheme="majorBidi"/>
+          <w:color w:val="0F4761" w:themeColor="accent1" w:themeShade="BF"/>
+        </w:rPr>
+      </w:pPr>
+      <w:r>
+        <w:rPr>
+          <w:rFonts w:asciiTheme="majorHAnsi" w:eastAsiaTheme="majorEastAsia" w:hAnsiTheme="majorHAnsi" w:cstheme="majorBidi"/>
+          <w:color w:val="0F4761" w:themeColor="accent1" w:themeShade="BF"/>
+        </w:rPr>
+        <w:t>M</w:t>
+      </w:r>
+      <w:r>
+        <w:rPr>
+          <w:rFonts w:asciiTheme="majorHAnsi" w:eastAsiaTheme="majorEastAsia" w:hAnsiTheme="majorHAnsi" w:cstheme="majorBidi"/>
+          <w:color w:val="0F4761" w:themeColor="accent1" w:themeShade="BF"/>
+        </w:rPr>
+        <w:t xml:space="preserve">eeting ID: 912 8788 </w:t>
+      </w:r>
+      <w:proofErr w:type="gramStart"/>
+      <w:r>
+        <w:rPr>
+          <w:rFonts w:asciiTheme="majorHAnsi" w:eastAsiaTheme="majorEastAsia" w:hAnsiTheme="majorHAnsi" w:cstheme="majorBidi"/>
+          <w:color w:val="0F4761" w:themeColor="accent1" w:themeShade="BF"/>
+        </w:rPr>
+        <w:t>3862</w:t>
+      </w:r>
+      <w:r>
+        <w:rPr>
+          <w:rFonts w:asciiTheme="majorHAnsi" w:eastAsiaTheme="majorEastAsia" w:hAnsiTheme="majorHAnsi" w:cstheme="majorBidi"/>
+          <w:color w:val="0F4761" w:themeColor="accent1" w:themeShade="BF"/>
+        </w:rPr>
+        <w:t xml:space="preserve">  </w:t>
+      </w:r>
+      <w:r>
+        <w:rPr>
+          <w:rFonts w:asciiTheme="majorHAnsi" w:eastAsiaTheme="majorEastAsia" w:hAnsiTheme="majorHAnsi" w:cstheme="majorBidi"/>
+          <w:color w:val="0F4761" w:themeColor="accent1" w:themeShade="BF"/>
+        </w:rPr>
+        <w:t>Passcode</w:t>
+      </w:r>
+      <w:proofErr w:type="gramEnd"/>
+      <w:r>
+        <w:rPr>
+          <w:rFonts w:asciiTheme="majorHAnsi" w:eastAsiaTheme="majorEastAsia" w:hAnsiTheme="majorHAnsi" w:cstheme="majorBidi"/>
+          <w:color w:val="0F4761" w:themeColor="accent1" w:themeShade="BF"/>
+        </w:rPr>
+        <w:t>: 101239</w:t>
+      </w:r>
+    </w:p>
+    <w:p>
+      <w:pPr>
+        <w:keepNext/>
+        <w:keepLines/>
+        <w:spacing w:before="360" w:after="80"/>
+        <w:outlineLvl w:val="0"/>
+        <w:rPr>
+          <w:rFonts w:asciiTheme="majorHAnsi" w:eastAsiaTheme="majorEastAsia" w:hAnsiTheme="majorHAnsi" w:cstheme="majorBidi"/>
+          <w:color w:val="0F4761" w:themeColor="accent1" w:themeShade="BF"/>
+        </w:rPr>
+      </w:pPr>
+      <w:r>
+        <w:rPr>
+          <w:rFonts w:asciiTheme="majorHAnsi" w:eastAsiaTheme="majorEastAsia" w:hAnsiTheme="majorHAnsi" w:cstheme="majorBidi"/>
+          <w:color w:val="0F4761" w:themeColor="accent1" w:themeShade="BF"/>
+        </w:rPr>
+        <w:t>One tap mobile</w:t>
+      </w:r>
+    </w:p>
+    <w:p>
+      <w:pPr>
+        <w:keepNext/>
+        <w:keepLines/>
+        <w:spacing w:before="360" w:after="80"/>
+        <w:outlineLvl w:val="0"/>
+        <w:rPr>
+          <w:rFonts w:asciiTheme="majorHAnsi" w:eastAsiaTheme="majorEastAsia" w:hAnsiTheme="majorHAnsi" w:cstheme="majorBidi"/>
+          <w:color w:val="0F4761" w:themeColor="accent1" w:themeShade="BF"/>
+        </w:rPr>
+      </w:pPr>
+      <w:r>
+        <w:rPr>
+          <w:rFonts w:asciiTheme="majorHAnsi" w:eastAsiaTheme="majorEastAsia" w:hAnsiTheme="majorHAnsi" w:cstheme="majorBidi"/>
+          <w:color w:val="0F4761" w:themeColor="accent1" w:themeShade="BF"/>
+        </w:rPr>
+        <w:t>+</w:t>
+      </w:r>
+      <w:proofErr w:type="gramStart"/>
+      <w:r>
+        <w:rPr>
+          <w:rFonts w:asciiTheme="majorHAnsi" w:eastAsiaTheme="majorEastAsia" w:hAnsiTheme="majorHAnsi" w:cstheme="majorBidi"/>
+          <w:color w:val="0F4761" w:themeColor="accent1" w:themeShade="BF"/>
+        </w:rPr>
+        <w:t>16465588656,,</w:t>
+      </w:r>
+      <w:proofErr w:type="gramEnd"/>
+      <w:r>
+        <w:rPr>
+          <w:rFonts w:asciiTheme="majorHAnsi" w:eastAsiaTheme="majorEastAsia" w:hAnsiTheme="majorHAnsi" w:cstheme="majorBidi"/>
+          <w:color w:val="0F4761" w:themeColor="accent1" w:themeShade="BF"/>
+        </w:rPr>
+        <w:t>91287883862# US (New York)</w:t>
+      </w:r>
+    </w:p>
+    <w:p>
+      <w:pPr>
+        <w:keepNext/>
+        <w:keepLines/>
+        <w:spacing w:before="360" w:after="80"/>
+        <w:outlineLvl w:val="0"/>
+        <w:rPr>
+          <w:rFonts w:asciiTheme="majorHAnsi" w:eastAsiaTheme="majorEastAsia" w:hAnsiTheme="majorHAnsi" w:cstheme="majorBidi"/>
+          <w:color w:val="0F4761" w:themeColor="accent1" w:themeShade="BF"/>
+        </w:rPr>
+      </w:pPr>
+      <w:r>
+        <w:rPr>
+          <w:rFonts w:asciiTheme="majorHAnsi" w:eastAsiaTheme="majorEastAsia" w:hAnsiTheme="majorHAnsi" w:cstheme="majorBidi"/>
+          <w:color w:val="0F4761" w:themeColor="accent1" w:themeShade="BF"/>
+        </w:rPr>
+        <w:t>+</w:t>
+      </w:r>
+      <w:proofErr w:type="gramStart"/>
+      <w:r>
+        <w:rPr>
+          <w:rFonts w:asciiTheme="majorHAnsi" w:eastAsiaTheme="majorEastAsia" w:hAnsiTheme="majorHAnsi" w:cstheme="majorBidi"/>
+          <w:color w:val="0F4761" w:themeColor="accent1" w:themeShade="BF"/>
+        </w:rPr>
+        <w:t>16469313860,,</w:t>
+      </w:r>
+      <w:proofErr w:type="gramEnd"/>
+      <w:r>
+        <w:rPr>
+          <w:rFonts w:asciiTheme="majorHAnsi" w:eastAsiaTheme="majorEastAsia" w:hAnsiTheme="majorHAnsi" w:cstheme="majorBidi"/>
+          <w:color w:val="0F4761" w:themeColor="accent1" w:themeShade="BF"/>
+        </w:rPr>
+        <w:t>91287883862# US</w:t>
+      </w:r>
+    </w:p>
+    <w:p>
+      <w:pPr>
+        <w:keepNext/>
+        <w:keepLines/>
+        <w:spacing w:before="360" w:after="80"/>
+        <w:outlineLvl w:val="0"/>
+        <w:rPr>
+          <w:rFonts w:asciiTheme="majorHAnsi" w:eastAsiaTheme="majorEastAsia" w:hAnsiTheme="majorHAnsi" w:cstheme="majorBidi"/>
+          <w:color w:val="0F4761" w:themeColor="accent1" w:themeShade="BF"/>
+        </w:rPr>
+      </w:pPr>
+      <w:r>
+        <w:rPr>
+          <w:rFonts w:asciiTheme="majorHAnsi" w:eastAsiaTheme="majorEastAsia" w:hAnsiTheme="majorHAnsi" w:cstheme="majorBidi"/>
+          <w:color w:val="0F4761" w:themeColor="accent1" w:themeShade="BF"/>
+        </w:rPr>
+        <w:t>Join By Phone</w:t>
+      </w:r>
+    </w:p>
+    <w:p>
+      <w:pPr>
+        <w:keepNext/>
+        <w:keepLines/>
+        <w:spacing w:before="360" w:after="80"/>
+        <w:outlineLvl w:val="0"/>
+        <w:rPr>
+          <w:rFonts w:asciiTheme="majorHAnsi" w:eastAsiaTheme="majorEastAsia" w:hAnsiTheme="majorHAnsi" w:cstheme="majorBidi"/>
+          <w:color w:val="0F4761" w:themeColor="accent1" w:themeShade="BF"/>
+        </w:rPr>
+      </w:pPr>
+      <w:r>
+        <w:rPr>
+          <w:rFonts w:asciiTheme="majorHAnsi" w:eastAsiaTheme="majorEastAsia" w:hAnsiTheme="majorHAnsi" w:cstheme="majorBidi"/>
+          <w:color w:val="0F4761" w:themeColor="accent1" w:themeShade="BF"/>
+        </w:rPr>
+        <w:t xml:space="preserve">        +1 646 558 8656 US (New York)</w:t>
+      </w:r>
+    </w:p>
+    <w:p>
+      <w:pPr>
+        <w:keepNext/>
+        <w:keepLines/>
+        <w:spacing w:before="360" w:after="80"/>
+        <w:outlineLvl w:val="0"/>
+        <w:rPr>
+          <w:rFonts w:asciiTheme="majorHAnsi" w:eastAsiaTheme="majorEastAsia" w:hAnsiTheme="majorHAnsi" w:cstheme="majorBidi"/>
+          <w:color w:val="0F4761" w:themeColor="accent1" w:themeShade="BF"/>
+        </w:rPr>
+      </w:pPr>
+      <w:r>
+        <w:rPr>
+          <w:rFonts w:asciiTheme="majorHAnsi" w:eastAsiaTheme="majorEastAsia" w:hAnsiTheme="majorHAnsi" w:cstheme="majorBidi"/>
+          <w:color w:val="0F4761" w:themeColor="accent1" w:themeShade="BF"/>
+        </w:rPr>
+        <w:t xml:space="preserve">        +1 646 931 3860 US</w:t>
+      </w:r>
+    </w:p>
+    <w:p>
+      <w:pPr>
+        <w:keepNext/>
+        <w:keepLines/>
+        <w:spacing w:before="360" w:after="80"/>
+        <w:outlineLvl w:val="0"/>
+        <w:rPr>
+          <w:rFonts w:asciiTheme="majorHAnsi" w:eastAsiaTheme="majorEastAsia" w:hAnsiTheme="majorHAnsi" w:cstheme="majorBidi"/>
+          <w:color w:val="0F4761" w:themeColor="accent1" w:themeShade="BF"/>
+        </w:rPr>
+      </w:pPr>
+      <w:r>
+        <w:rPr>
+          <w:rFonts w:asciiTheme="majorHAnsi" w:eastAsiaTheme="majorEastAsia" w:hAnsiTheme="majorHAnsi" w:cstheme="majorBidi"/>
+          <w:color w:val="0F4761" w:themeColor="accent1" w:themeShade="BF"/>
+        </w:rPr>
+        <w:t xml:space="preserve">        +1 301 715 8592 US (Washington DC)</w:t>
+      </w:r>
+    </w:p>
+    <w:p>
+      <w:pPr>
+        <w:keepNext/>
+        <w:keepLines/>
+        <w:spacing w:before="360" w:after="80"/>
+        <w:outlineLvl w:val="0"/>
+        <w:rPr>
+          <w:rFonts w:asciiTheme="majorHAnsi" w:eastAsiaTheme="majorEastAsia" w:hAnsiTheme="majorHAnsi" w:cstheme="majorBidi"/>
+          <w:color w:val="0F4761" w:themeColor="accent1" w:themeShade="BF"/>
+        </w:rPr>
+      </w:pPr>
+      <w:r>
+        <w:rPr>
+          <w:rFonts w:asciiTheme="majorHAnsi" w:eastAsiaTheme="majorEastAsia" w:hAnsiTheme="majorHAnsi" w:cstheme="majorBidi"/>
+          <w:color w:val="0F4761" w:themeColor="accent1" w:themeShade="BF"/>
+        </w:rPr>
+        <w:lastRenderedPageBreak/>
+        <w:t>Meeting ID: 912 8788 3862</w:t>
+      </w:r>
+    </w:p>
+    <w:p>
+      <w:pPr>
+        <w:keepNext/>
+        <w:keepLines/>
+        <w:spacing w:before="360" w:after="80"/>
+        <w:outlineLvl w:val="0"/>
+        <w:rPr>
+          <w:rFonts w:asciiTheme="majorHAnsi" w:eastAsiaTheme="majorEastAsia" w:hAnsiTheme="majorHAnsi" w:cstheme="majorBidi"/>
+          <w:color w:val="0F4761" w:themeColor="accent1" w:themeShade="BF"/>
+          <w:sz w:val="40"/>
+          <w:szCs w:val="40"/>
+        </w:rPr>
+      </w:pPr>
+      <w:r>
+        <w:rPr>
+          <w:rFonts w:asciiTheme="majorHAnsi" w:eastAsiaTheme="majorEastAsia" w:hAnsiTheme="majorHAnsi" w:cstheme="majorBidi"/>
+          <w:color w:val="0F4761" w:themeColor="accent1" w:themeShade="BF"/>
+          <w:sz w:val="40"/>
+          <w:szCs w:val="40"/>
+        </w:rPr>
+        <w:t>Required Tuesday &amp; Thursday TA Sessions</w:t>
+      </w:r>
+    </w:p>
+    <w:p>
+      <w:pPr>
+        <w:keepNext/>
+        <w:keepLines/>
+        <w:spacing w:before="360" w:after="80"/>
+        <w:outlineLvl w:val="0"/>
+        <w:rPr>
+          <w:rFonts w:asciiTheme="majorHAnsi" w:eastAsiaTheme="majorEastAsia" w:hAnsiTheme="majorHAnsi" w:cstheme="majorBidi"/>
+          <w:color w:val="0F4761" w:themeColor="accent1" w:themeShade="BF"/>
+          <w:sz w:val="40"/>
+          <w:szCs w:val="40"/>
+        </w:rPr>
+      </w:pPr>
+      <w:r>
+        <w:rPr>
+          <w:rFonts w:asciiTheme="majorHAnsi" w:eastAsiaTheme="majorEastAsia" w:hAnsiTheme="majorHAnsi" w:cstheme="majorBidi"/>
+          <w:color w:val="0F4761" w:themeColor="accent1" w:themeShade="BF"/>
+          <w:sz w:val="40"/>
+          <w:szCs w:val="40"/>
+        </w:rPr>
+        <w:t>(Tuesday/Thursday 1210-130pm TA Sessions</w:t>
+      </w:r>
+      <w:r>
+        <w:rPr>
+          <w:rFonts w:asciiTheme="majorHAnsi" w:eastAsiaTheme="majorEastAsia" w:hAnsiTheme="majorHAnsi" w:cstheme="majorBidi"/>
+          <w:color w:val="0F4761" w:themeColor="accent1" w:themeShade="BF"/>
+          <w:sz w:val="40"/>
+          <w:szCs w:val="40"/>
+        </w:rPr>
+        <w:t>)</w:t>
+      </w:r>
+    </w:p>
+    <w:p>
+      <w:r>
+        <w:t xml:space="preserve">        Every week on Tue, Thu, until May 14, 2026, 33 occurrence(s)</w:t>
+      </w:r>
+    </w:p>
+    <w:p>
+      <w:r>
+        <w:t>Weekly: https://rutgers.zoom.us/meeting/tJ0sceqtqjksGtdP0lNophBYoJfspagsZ8Ns/ics?icsToken=DCFr5E8BOiPE3bhoGgAALAAAAMdyqhUlW65lCb0f9kKncaTUFSwyAse-egk4PGfY1wOeK38fGD06AobZEBS7K-GwxkOgCukifV0hG15B_TAwMDAwMQ</w:t>
+      </w:r>
+    </w:p>
+    <w:p>
+      <w:r>
+        <w:t>Join Zoom Meeting</w:t>
+      </w:r>
+    </w:p>
+    <w:p>
+      <w:hyperlink r:id="rId61" w:history="1">
+        <w:r>
+          <w:rPr>
+            <w:rStyle w:val="Hyperlink"/>
+          </w:rPr>
+          <w:t>https://rutgers.zoom.us/j/99163542603?pwd=Y6Geby7WVwbWrMawgW8PFXnwmMNQjp.1</w:t>
+        </w:r>
+      </w:hyperlink>
+    </w:p>
+    <w:p>
+      <w:r>
+        <w:t>Join by SIP</w:t>
+      </w:r>
+      <w:r>
+        <w:t xml:space="preserve"> </w:t>
+      </w:r>
+      <w:r>
+        <w:t>99163542603@zoomcrc.com</w:t>
+      </w:r>
+    </w:p>
+    <w:p>
+      <w:r>
+        <w:t>Meeting ID: 991 6354 2603</w:t>
+      </w:r>
+      <w:r>
+        <w:t xml:space="preserve"> </w:t>
+      </w:r>
+      <w:r>
+        <w:t>Passcode: 893075</w:t>
+      </w:r>
+    </w:p>
+    <w:p>
+      <w:r>
+        <w:t>One tap mobile</w:t>
+      </w:r>
+    </w:p>
+    <w:p>
+      <w:r>
+        <w:t>+</w:t>
+      </w:r>
+      <w:proofErr w:type="gramStart"/>
+      <w:r>
+        <w:t>13126266799,,</w:t>
+      </w:r>
+      <w:proofErr w:type="gramEnd"/>
+      <w:r>
+        <w:t>99163542603# US (Chicago)</w:t>
+      </w:r>
+    </w:p>
+    <w:p>
+      <w:r>
+        <w:t>+</w:t>
+      </w:r>
+      <w:proofErr w:type="gramStart"/>
+      <w:r>
+        <w:t>16465588656,,</w:t>
+      </w:r>
+      <w:proofErr w:type="gramEnd"/>
+      <w:r>
+        <w:t>99163542603# US (New York)</w:t>
+      </w:r>
+    </w:p>
+    <w:p>
+      <w:r>
+        <w:t>Join By Phone</w:t>
+      </w:r>
+    </w:p>
+    <w:p>
+      <w:r>
+        <w:t xml:space="preserve">        +1 312 626 6799 US (Chicago)</w:t>
+      </w:r>
+    </w:p>
+    <w:p>
+      <w:r>
+        <w:t xml:space="preserve">        +1 646 558 8656 US (New York)</w:t>
+      </w:r>
+    </w:p>
+    <w:p>
+      <w:r>
+        <w:t xml:space="preserve">        +1 646 931 3860 US</w:t>
+      </w:r>
+    </w:p>
+    <w:p>
+      <w:r>
+        <w:t xml:space="preserve">        +1 301 715 8592 US (Washington DC)</w:t>
+      </w:r>
+    </w:p>
+    <w:p>
+      <w:r>
+        <w:t>Meeting ID: 991 6354 2603</w:t>
+      </w:r>
+    </w:p>
+    <w:p>
+      <w:r>
+        <w:t>Find your local number: https://rutgers.zoom.us/u/acAkB6dK2R</w:t>
+      </w:r>
+    </w:p>
+    <w:p>
+      <w:r>
+        <w:t xml:space="preserve">If you have any questions, please &lt;a </w:t>
+      </w:r>
+      <w:proofErr w:type="spellStart"/>
+      <w:r>
+        <w:t>href</w:t>
+      </w:r>
+      <w:proofErr w:type="spellEnd"/>
+      <w:r>
+        <w:t>="https://it.rutgers.edu/help-support/"&gt;contact the Office of Information Technology Help Desk&lt;/a&gt;</w:t>
+      </w:r>
+    </w:p>
     <w:sectPr>
+      <w:footerReference w:type="default" r:id="rId62"/>
       <w:pgSz w:w="12240" w:h="15840"/>
       <w:pgMar w:top="1440" w:right="1440" w:bottom="1440" w:left="1440" w:header="720" w:footer="720" w:gutter="0"/>
       <w:cols w:space="720"/>
@@ -10593,6 +12109,112 @@
 </w:document>
 </file>
 
+<file path=word/endnotes.xml><?xml version="1.0" encoding="utf-8"?>
+<w:endnotes xmlns:wpc="http://schemas.microsoft.com/office/word/2010/wordprocessingCanvas" xmlns:cx="http://schemas.microsoft.com/office/drawing/2014/chartex" xmlns:cx1="http://schemas.microsoft.com/office/drawing/2015/9/8/chartex" xmlns:cx2="http://schemas.microsoft.com/office/drawing/2015/10/21/chartex" xmlns:cx3="http://schemas.microsoft.com/office/drawing/2016/5/9/chartex" xmlns:cx4="http://schemas.microsoft.com/office/drawing/2016/5/10/chartex" xmlns:cx5="http://schemas.microsoft.com/office/drawing/2016/5/11/chartex" xmlns:cx6="http://schemas.microsoft.com/office/drawing/2016/5/12/chartex" xmlns:cx7="http://schemas.microsoft.com/office/drawing/2016/5/13/chartex" xmlns:cx8="http://schemas.microsoft.com/office/drawing/2016/5/14/chartex" xmlns:mc="http://schemas.openxmlformats.org/markup-compatibility/2006" xmlns:aink="http://schemas.microsoft.com/office/drawing/2016/ink" xmlns:am3d="http://schemas.microsoft.com/office/drawing/2017/model3d" xmlns:o="urn:schemas-microsoft-com:office:office" xmlns:oel="http://schemas.microsoft.com/office/2019/extlst" xmlns:r="http://schemas.openxmlformats.org/officeDocument/2006/relationships" xmlns:m="http://schemas.openxmlformats.org/officeDocument/2006/math" xmlns:v="urn:schemas-microsoft-com:vml" xmlns:wp14="http://schemas.microsoft.com/office/word/2010/wordprocessingDrawing" xmlns:wp="http://schemas.openxmlformats.org/drawingml/2006/wordprocessingDrawing" xmlns:w10="urn:schemas-microsoft-com:office:word" xmlns:w="http://schemas.openxmlformats.org/wordprocessingml/2006/main" xmlns:w14="http://schemas.microsoft.com/office/word/2010/wordml" xmlns:w15="http://schemas.microsoft.com/office/word/2012/wordml" xmlns:w16cex="http://schemas.microsoft.com/office/word/2018/wordml/cex" xmlns:w16cid="http://schemas.microsoft.com/office/word/2016/wordml/cid" xmlns:w16="http://schemas.microsoft.com/office/word/2018/wordml" xmlns:w16du="http://schemas.microsoft.com/office/word/2023/wordml/word16du" xmlns:w16sdtdh="http://schemas.microsoft.com/office/word/2020/wordml/sdtdatahash" xmlns:w16sdtfl="http://schemas.microsoft.com/office/word/2024/wordml/sdtformatlock" xmlns:w16se="http://schemas.microsoft.com/office/word/2015/wordml/symex" xmlns:wpg="http://schemas.microsoft.com/office/word/2010/wordprocessingGroup" xmlns:wpi="http://schemas.microsoft.com/office/word/2010/wordprocessingInk" xmlns:wne="http://schemas.microsoft.com/office/word/2006/wordml" xmlns:wps="http://schemas.microsoft.com/office/word/2010/wordprocessingShape" mc:Ignorable="w14 w15 w16se w16cid w16 w16cex w16sdtdh w16sdtfl w16du wp14">
+  <w:endnote w:type="separator" w:id="-1">
+    <w:p>
+      <w:pPr>
+        <w:spacing w:after="0" w:line="240" w:lineRule="auto"/>
+      </w:pPr>
+      <w:r>
+        <w:separator/>
+      </w:r>
+    </w:p>
+  </w:endnote>
+  <w:endnote w:type="continuationSeparator" w:id="0">
+    <w:p>
+      <w:pPr>
+        <w:spacing w:after="0" w:line="240" w:lineRule="auto"/>
+      </w:pPr>
+      <w:r>
+        <w:continuationSeparator/>
+      </w:r>
+    </w:p>
+  </w:endnote>
+</w:endnotes>
+</file>
+
+<file path=word/footer1.xml><?xml version="1.0" encoding="utf-8"?>
+<w:ftr xmlns:wpc="http://schemas.microsoft.com/office/word/2010/wordprocessingCanvas" xmlns:cx="http://schemas.microsoft.com/office/drawing/2014/chartex" xmlns:cx1="http://schemas.microsoft.com/office/drawing/2015/9/8/chartex" xmlns:cx2="http://schemas.microsoft.com/office/drawing/2015/10/21/chartex" xmlns:cx3="http://schemas.microsoft.com/office/drawing/2016/5/9/chartex" xmlns:cx4="http://schemas.microsoft.com/office/drawing/2016/5/10/chartex" xmlns:cx5="http://schemas.microsoft.com/office/drawing/2016/5/11/chartex" xmlns:cx6="http://schemas.microsoft.com/office/drawing/2016/5/12/chartex" xmlns:cx7="http://schemas.microsoft.com/office/drawing/2016/5/13/chartex" xmlns:cx8="http://schemas.microsoft.com/office/drawing/2016/5/14/chartex" xmlns:mc="http://schemas.openxmlformats.org/markup-compatibility/2006" xmlns:aink="http://schemas.microsoft.com/office/drawing/2016/ink" xmlns:am3d="http://schemas.microsoft.com/office/drawing/2017/model3d" xmlns:o="urn:schemas-microsoft-com:office:office" xmlns:oel="http://schemas.microsoft.com/office/2019/extlst" xmlns:r="http://schemas.openxmlformats.org/officeDocument/2006/relationships" xmlns:m="http://schemas.openxmlformats.org/officeDocument/2006/math" xmlns:v="urn:schemas-microsoft-com:vml" xmlns:wp14="http://schemas.microsoft.com/office/word/2010/wordprocessingDrawing" xmlns:wp="http://schemas.openxmlformats.org/drawingml/2006/wordprocessingDrawing" xmlns:w10="urn:schemas-microsoft-com:office:word" xmlns:w="http://schemas.openxmlformats.org/wordprocessingml/2006/main" xmlns:w14="http://schemas.microsoft.com/office/word/2010/wordml" xmlns:w15="http://schemas.microsoft.com/office/word/2012/wordml" xmlns:w16cex="http://schemas.microsoft.com/office/word/2018/wordml/cex" xmlns:w16cid="http://schemas.microsoft.com/office/word/2016/wordml/cid" xmlns:w16="http://schemas.microsoft.com/office/word/2018/wordml" xmlns:w16du="http://schemas.microsoft.com/office/word/2023/wordml/word16du" xmlns:w16sdtdh="http://schemas.microsoft.com/office/word/2020/wordml/sdtdatahash" xmlns:w16sdtfl="http://schemas.microsoft.com/office/word/2024/wordml/sdtformatlock" xmlns:w16se="http://schemas.microsoft.com/office/word/2015/wordml/symex" xmlns:wpg="http://schemas.microsoft.com/office/word/2010/wordprocessingGroup" xmlns:wpi="http://schemas.microsoft.com/office/word/2010/wordprocessingInk" xmlns:wne="http://schemas.microsoft.com/office/word/2006/wordml" xmlns:wps="http://schemas.microsoft.com/office/word/2010/wordprocessingShape" mc:Ignorable="w14 w15 w16se w16cid w16 w16cex w16sdtdh w16sdtfl w16du wp14">
+  <w:sdt>
+    <w:sdtPr>
+      <w:id w:val="-371615913"/>
+      <w:docPartObj>
+        <w:docPartGallery w:val="Page Numbers (Bottom of Page)"/>
+        <w:docPartUnique/>
+      </w:docPartObj>
+    </w:sdtPr>
+    <w:sdtEndPr>
+      <w:rPr>
+        <w:noProof/>
+      </w:rPr>
+    </w:sdtEndPr>
+    <w:sdtContent>
+      <w:p>
+        <w:pPr>
+          <w:pStyle w:val="Footer"/>
+          <w:jc w:val="right"/>
+        </w:pPr>
+        <w:r>
+          <w:fldChar w:fldCharType="begin"/>
+        </w:r>
+        <w:r>
+          <w:instrText xml:space="preserve"> PAGE   \* MERGEFORMAT </w:instrText>
+        </w:r>
+        <w:r>
+          <w:fldChar w:fldCharType="separate"/>
+        </w:r>
+        <w:r>
+          <w:rPr>
+            <w:noProof/>
+          </w:rPr>
+          <w:t>2</w:t>
+        </w:r>
+        <w:r>
+          <w:rPr>
+            <w:noProof/>
+          </w:rPr>
+          <w:fldChar w:fldCharType="end"/>
+        </w:r>
+      </w:p>
+    </w:sdtContent>
+  </w:sdt>
+  <w:p>
+    <w:pPr>
+      <w:pStyle w:val="Footer"/>
+    </w:pPr>
+    <w:r>
+      <w:t>AI Enabled Informatics for Engineers, Syllabus (Spring 2026)</w:t>
+    </w:r>
+  </w:p>
+</w:ftr>
+</file>
+
+<file path=word/footnotes.xml><?xml version="1.0" encoding="utf-8"?>
+<w:footnotes xmlns:wpc="http://schemas.microsoft.com/office/word/2010/wordprocessingCanvas" xmlns:cx="http://schemas.microsoft.com/office/drawing/2014/chartex" xmlns:cx1="http://schemas.microsoft.com/office/drawing/2015/9/8/chartex" xmlns:cx2="http://schemas.microsoft.com/office/drawing/2015/10/21/chartex" xmlns:cx3="http://schemas.microsoft.com/office/drawing/2016/5/9/chartex" xmlns:cx4="http://schemas.microsoft.com/office/drawing/2016/5/10/chartex" xmlns:cx5="http://schemas.microsoft.com/office/drawing/2016/5/11/chartex" xmlns:cx6="http://schemas.microsoft.com/office/drawing/2016/5/12/chartex" xmlns:cx7="http://schemas.microsoft.com/office/drawing/2016/5/13/chartex" xmlns:cx8="http://schemas.microsoft.com/office/drawing/2016/5/14/chartex" xmlns:mc="http://schemas.openxmlformats.org/markup-compatibility/2006" xmlns:aink="http://schemas.microsoft.com/office/drawing/2016/ink" xmlns:am3d="http://schemas.microsoft.com/office/drawing/2017/model3d" xmlns:o="urn:schemas-microsoft-com:office:office" xmlns:oel="http://schemas.microsoft.com/office/2019/extlst" xmlns:r="http://schemas.openxmlformats.org/officeDocument/2006/relationships" xmlns:m="http://schemas.openxmlformats.org/officeDocument/2006/math" xmlns:v="urn:schemas-microsoft-com:vml" xmlns:wp14="http://schemas.microsoft.com/office/word/2010/wordprocessingDrawing" xmlns:wp="http://schemas.openxmlformats.org/drawingml/2006/wordprocessingDrawing" xmlns:w10="urn:schemas-microsoft-com:office:word" xmlns:w="http://schemas.openxmlformats.org/wordprocessingml/2006/main" xmlns:w14="http://schemas.microsoft.com/office/word/2010/wordml" xmlns:w15="http://schemas.microsoft.com/office/word/2012/wordml" xmlns:w16cex="http://schemas.microsoft.com/office/word/2018/wordml/cex" xmlns:w16cid="http://schemas.microsoft.com/office/word/2016/wordml/cid" xmlns:w16="http://schemas.microsoft.com/office/word/2018/wordml" xmlns:w16du="http://schemas.microsoft.com/office/word/2023/wordml/word16du" xmlns:w16sdtdh="http://schemas.microsoft.com/office/word/2020/wordml/sdtdatahash" xmlns:w16sdtfl="http://schemas.microsoft.com/office/word/2024/wordml/sdtformatlock" xmlns:w16se="http://schemas.microsoft.com/office/word/2015/wordml/symex" xmlns:wpg="http://schemas.microsoft.com/office/word/2010/wordprocessingGroup" xmlns:wpi="http://schemas.microsoft.com/office/word/2010/wordprocessingInk" xmlns:wne="http://schemas.microsoft.com/office/word/2006/wordml" xmlns:wps="http://schemas.microsoft.com/office/word/2010/wordprocessingShape" mc:Ignorable="w14 w15 w16se w16cid w16 w16cex w16sdtdh w16sdtfl w16du wp14">
+  <w:footnote w:type="separator" w:id="-1">
+    <w:p>
+      <w:pPr>
+        <w:spacing w:after="0" w:line="240" w:lineRule="auto"/>
+      </w:pPr>
+      <w:r>
+        <w:separator/>
+      </w:r>
+    </w:p>
+  </w:footnote>
+  <w:footnote w:type="continuationSeparator" w:id="0">
+    <w:p>
+      <w:pPr>
+        <w:spacing w:after="0" w:line="240" w:lineRule="auto"/>
+      </w:pPr>
+      <w:r>
+        <w:continuationSeparator/>
+      </w:r>
+    </w:p>
+  </w:footnote>
+</w:footnotes>
+</file>
+
 <file path=word/numbering.xml><?xml version="1.0" encoding="utf-8"?>
 <w:numbering xmlns:wpc="http://schemas.microsoft.com/office/word/2010/wordprocessingCanvas" xmlns:cx="http://schemas.microsoft.com/office/drawing/2014/chartex" xmlns:cx1="http://schemas.microsoft.com/office/drawing/2015/9/8/chartex" xmlns:cx2="http://schemas.microsoft.com/office/drawing/2015/10/21/chartex" xmlns:cx3="http://schemas.microsoft.com/office/drawing/2016/5/9/chartex" xmlns:cx4="http://schemas.microsoft.com/office/drawing/2016/5/10/chartex" xmlns:cx5="http://schemas.microsoft.com/office/drawing/2016/5/11/chartex" xmlns:cx6="http://schemas.microsoft.com/office/drawing/2016/5/12/chartex" xmlns:cx7="http://schemas.microsoft.com/office/drawing/2016/5/13/chartex" xmlns:cx8="http://schemas.microsoft.com/office/drawing/2016/5/14/chartex" xmlns:mc="http://schemas.openxmlformats.org/markup-compatibility/2006" xmlns:aink="http://schemas.microsoft.com/office/drawing/2016/ink" xmlns:am3d="http://schemas.microsoft.com/office/drawing/2017/model3d" xmlns:o="urn:schemas-microsoft-com:office:office" xmlns:oel="http://schemas.microsoft.com/office/2019/extlst" xmlns:r="http://schemas.openxmlformats.org/officeDocument/2006/relationships" xmlns:m="http://schemas.openxmlformats.org/officeDocument/2006/math" xmlns:v="urn:schemas-microsoft-com:vml" xmlns:wp14="http://schemas.microsoft.com/office/word/2010/wordprocessingDrawing" xmlns:wp="http://schemas.openxmlformats.org/drawingml/2006/wordprocessingDrawing" xmlns:w10="urn:schemas-microsoft-com:office:word" xmlns:w="http://schemas.openxmlformats.org/wordprocessingml/2006/main" xmlns:w14="http://schemas.microsoft.com/office/word/2010/wordml" xmlns:w15="http://schemas.microsoft.com/office/word/2012/wordml" xmlns:w16cex="http://schemas.microsoft.com/office/word/2018/wordml/cex" xmlns:w16cid="http://schemas.microsoft.com/office/word/2016/wordml/cid" xmlns:w16="http://schemas.microsoft.com/office/word/2018/wordml" xmlns:w16du="http://schemas.microsoft.com/office/word/2023/wordml/word16du" xmlns:w16sdtdh="http://schemas.microsoft.com/office/word/2020/wordml/sdtdatahash" xmlns:w16sdtfl="http://schemas.microsoft.com/office/word/2024/wordml/sdtformatlock" xmlns:w16se="http://schemas.microsoft.com/office/word/2015/wordml/symex" xmlns:wpg="http://schemas.microsoft.com/office/word/2010/wordprocessingGroup" xmlns:wpi="http://schemas.microsoft.com/office/word/2010/wordprocessingInk" xmlns:wne="http://schemas.microsoft.com/office/word/2006/wordml" xmlns:wps="http://schemas.microsoft.com/office/word/2010/wordprocessingShape" mc:Ignorable="w14 w15 w16se w16cid w16 w16cex w16sdtdh w16sdtfl w16du wp14">
   <w:abstractNum w:abstractNumId="0" w15:restartNumberingAfterBreak="0">
@@ -12533,6 +14155,95 @@
     </w:lvl>
   </w:abstractNum>
   <w:abstractNum w:abstractNumId="13" w15:restartNumberingAfterBreak="0">
+    <w:nsid w:val="4BEF4EAA"/>
+    <w:multiLevelType w:val="hybridMultilevel"/>
+    <w:tmpl w:val="70C23932"/>
+    <w:lvl w:ilvl="0" w:tplc="884AFC22">
+      <w:start w:val="1"/>
+      <w:numFmt w:val="decimal"/>
+      <w:lvlText w:val="(%1)"/>
+      <w:lvlJc w:val="left"/>
+      <w:pPr>
+        <w:ind w:left="720" w:hanging="360"/>
+      </w:pPr>
+      <w:rPr>
+        <w:rFonts w:hint="default"/>
+      </w:rPr>
+    </w:lvl>
+    <w:lvl w:ilvl="1" w:tplc="04090019" w:tentative="1">
+      <w:start w:val="1"/>
+      <w:numFmt w:val="lowerLetter"/>
+      <w:lvlText w:val="%2."/>
+      <w:lvlJc w:val="left"/>
+      <w:pPr>
+        <w:ind w:left="1440" w:hanging="360"/>
+      </w:pPr>
+    </w:lvl>
+    <w:lvl w:ilvl="2" w:tplc="0409001B" w:tentative="1">
+      <w:start w:val="1"/>
+      <w:numFmt w:val="lowerRoman"/>
+      <w:lvlText w:val="%3."/>
+      <w:lvlJc w:val="right"/>
+      <w:pPr>
+        <w:ind w:left="2160" w:hanging="180"/>
+      </w:pPr>
+    </w:lvl>
+    <w:lvl w:ilvl="3" w:tplc="0409000F" w:tentative="1">
+      <w:start w:val="1"/>
+      <w:numFmt w:val="decimal"/>
+      <w:lvlText w:val="%4."/>
+      <w:lvlJc w:val="left"/>
+      <w:pPr>
+        <w:ind w:left="2880" w:hanging="360"/>
+      </w:pPr>
+    </w:lvl>
+    <w:lvl w:ilvl="4" w:tplc="04090019" w:tentative="1">
+      <w:start w:val="1"/>
+      <w:numFmt w:val="lowerLetter"/>
+      <w:lvlText w:val="%5."/>
+      <w:lvlJc w:val="left"/>
+      <w:pPr>
+        <w:ind w:left="3600" w:hanging="360"/>
+      </w:pPr>
+    </w:lvl>
+    <w:lvl w:ilvl="5" w:tplc="0409001B" w:tentative="1">
+      <w:start w:val="1"/>
+      <w:numFmt w:val="lowerRoman"/>
+      <w:lvlText w:val="%6."/>
+      <w:lvlJc w:val="right"/>
+      <w:pPr>
+        <w:ind w:left="4320" w:hanging="180"/>
+      </w:pPr>
+    </w:lvl>
+    <w:lvl w:ilvl="6" w:tplc="0409000F" w:tentative="1">
+      <w:start w:val="1"/>
+      <w:numFmt w:val="decimal"/>
+      <w:lvlText w:val="%7."/>
+      <w:lvlJc w:val="left"/>
+      <w:pPr>
+        <w:ind w:left="5040" w:hanging="360"/>
+      </w:pPr>
+    </w:lvl>
+    <w:lvl w:ilvl="7" w:tplc="04090019" w:tentative="1">
+      <w:start w:val="1"/>
+      <w:numFmt w:val="lowerLetter"/>
+      <w:lvlText w:val="%8."/>
+      <w:lvlJc w:val="left"/>
+      <w:pPr>
+        <w:ind w:left="5760" w:hanging="360"/>
+      </w:pPr>
+    </w:lvl>
+    <w:lvl w:ilvl="8" w:tplc="0409001B" w:tentative="1">
+      <w:start w:val="1"/>
+      <w:numFmt w:val="lowerRoman"/>
+      <w:lvlText w:val="%9."/>
+      <w:lvlJc w:val="right"/>
+      <w:pPr>
+        <w:ind w:left="6480" w:hanging="180"/>
+      </w:pPr>
+    </w:lvl>
+  </w:abstractNum>
+  <w:abstractNum w:abstractNumId="14" w15:restartNumberingAfterBreak="0">
     <w:nsid w:val="4C772DA7"/>
     <w:multiLevelType w:val="multilevel"/>
     <w:tmpl w:val="47D2D5F2"/>
@@ -12681,7 +14392,7 @@
       </w:rPr>
     </w:lvl>
   </w:abstractNum>
-  <w:abstractNum w:abstractNumId="14" w15:restartNumberingAfterBreak="0">
+  <w:abstractNum w:abstractNumId="15" w15:restartNumberingAfterBreak="0">
     <w:nsid w:val="4CF17BF0"/>
     <w:multiLevelType w:val="multilevel"/>
     <w:tmpl w:val="DEE8E454"/>
@@ -12830,7 +14541,7 @@
       </w:rPr>
     </w:lvl>
   </w:abstractNum>
-  <w:abstractNum w:abstractNumId="15" w15:restartNumberingAfterBreak="0">
+  <w:abstractNum w:abstractNumId="16" w15:restartNumberingAfterBreak="0">
     <w:nsid w:val="55C47A1D"/>
     <w:multiLevelType w:val="multilevel"/>
     <w:tmpl w:val="D7661982"/>
@@ -12979,7 +14690,7 @@
       </w:rPr>
     </w:lvl>
   </w:abstractNum>
-  <w:abstractNum w:abstractNumId="16" w15:restartNumberingAfterBreak="0">
+  <w:abstractNum w:abstractNumId="17" w15:restartNumberingAfterBreak="0">
     <w:nsid w:val="592100F7"/>
     <w:multiLevelType w:val="multilevel"/>
     <w:tmpl w:val="8816189E"/>
@@ -13128,7 +14839,7 @@
       </w:rPr>
     </w:lvl>
   </w:abstractNum>
-  <w:abstractNum w:abstractNumId="17" w15:restartNumberingAfterBreak="0">
+  <w:abstractNum w:abstractNumId="18" w15:restartNumberingAfterBreak="0">
     <w:nsid w:val="5D9E34FE"/>
     <w:multiLevelType w:val="multilevel"/>
     <w:tmpl w:val="49686966"/>
@@ -13277,7 +14988,7 @@
       </w:rPr>
     </w:lvl>
   </w:abstractNum>
-  <w:abstractNum w:abstractNumId="18" w15:restartNumberingAfterBreak="0">
+  <w:abstractNum w:abstractNumId="19" w15:restartNumberingAfterBreak="0">
     <w:nsid w:val="5EFC384D"/>
     <w:multiLevelType w:val="multilevel"/>
     <w:tmpl w:val="1ECAAF22"/>
@@ -13426,7 +15137,7 @@
       </w:rPr>
     </w:lvl>
   </w:abstractNum>
-  <w:abstractNum w:abstractNumId="19" w15:restartNumberingAfterBreak="0">
+  <w:abstractNum w:abstractNumId="20" w15:restartNumberingAfterBreak="0">
     <w:nsid w:val="66872649"/>
     <w:multiLevelType w:val="multilevel"/>
     <w:tmpl w:val="E4485234"/>
@@ -13575,7 +15286,7 @@
       </w:rPr>
     </w:lvl>
   </w:abstractNum>
-  <w:abstractNum w:abstractNumId="20" w15:restartNumberingAfterBreak="0">
+  <w:abstractNum w:abstractNumId="21" w15:restartNumberingAfterBreak="0">
     <w:nsid w:val="7A9617D5"/>
     <w:multiLevelType w:val="multilevel"/>
     <w:tmpl w:val="11A406F4"/>
@@ -13724,7 +15435,7 @@
       </w:rPr>
     </w:lvl>
   </w:abstractNum>
-  <w:abstractNum w:abstractNumId="21" w15:restartNumberingAfterBreak="0">
+  <w:abstractNum w:abstractNumId="22" w15:restartNumberingAfterBreak="0">
     <w:nsid w:val="7CED51B5"/>
     <w:multiLevelType w:val="multilevel"/>
     <w:tmpl w:val="8A4CFE48"/>
@@ -13873,7 +15584,7 @@
       </w:rPr>
     </w:lvl>
   </w:abstractNum>
-  <w:abstractNum w:abstractNumId="22" w15:restartNumberingAfterBreak="0">
+  <w:abstractNum w:abstractNumId="23" w15:restartNumberingAfterBreak="0">
     <w:nsid w:val="7E054D62"/>
     <w:multiLevelType w:val="multilevel"/>
     <w:tmpl w:val="E7BA6A3E"/>
@@ -13987,16 +15698,16 @@
     </w:lvl>
   </w:abstractNum>
   <w:num w:numId="1" w16cid:durableId="346251065">
-    <w:abstractNumId w:val="22"/>
+    <w:abstractNumId w:val="23"/>
   </w:num>
   <w:num w:numId="2" w16cid:durableId="1817257183">
-    <w:abstractNumId w:val="16"/>
+    <w:abstractNumId w:val="17"/>
   </w:num>
   <w:num w:numId="3" w16cid:durableId="1745178043">
     <w:abstractNumId w:val="10"/>
   </w:num>
   <w:num w:numId="4" w16cid:durableId="758067026">
-    <w:abstractNumId w:val="13"/>
+    <w:abstractNumId w:val="14"/>
   </w:num>
   <w:num w:numId="5" w16cid:durableId="1074086373">
     <w:abstractNumId w:val="0"/>
@@ -14017,10 +15728,10 @@
     <w:abstractNumId w:val="5"/>
   </w:num>
   <w:num w:numId="11" w16cid:durableId="1900821746">
-    <w:abstractNumId w:val="17"/>
+    <w:abstractNumId w:val="18"/>
   </w:num>
   <w:num w:numId="12" w16cid:durableId="1960986616">
-    <w:abstractNumId w:val="15"/>
+    <w:abstractNumId w:val="16"/>
   </w:num>
   <w:num w:numId="13" w16cid:durableId="1655647305">
     <w:abstractNumId w:val="6"/>
@@ -14029,16 +15740,16 @@
     <w:abstractNumId w:val="2"/>
   </w:num>
   <w:num w:numId="15" w16cid:durableId="2036811096">
-    <w:abstractNumId w:val="19"/>
+    <w:abstractNumId w:val="20"/>
   </w:num>
   <w:num w:numId="16" w16cid:durableId="105080019">
-    <w:abstractNumId w:val="20"/>
+    <w:abstractNumId w:val="21"/>
   </w:num>
   <w:num w:numId="17" w16cid:durableId="2044939899">
-    <w:abstractNumId w:val="14"/>
+    <w:abstractNumId w:val="15"/>
   </w:num>
   <w:num w:numId="18" w16cid:durableId="1515000437">
-    <w:abstractNumId w:val="21"/>
+    <w:abstractNumId w:val="22"/>
   </w:num>
   <w:num w:numId="19" w16cid:durableId="509301329">
     <w:abstractNumId w:val="12"/>
@@ -14050,10 +15761,13 @@
     <w:abstractNumId w:val="8"/>
   </w:num>
   <w:num w:numId="22" w16cid:durableId="796021195">
-    <w:abstractNumId w:val="18"/>
+    <w:abstractNumId w:val="19"/>
   </w:num>
   <w:num w:numId="23" w16cid:durableId="678580519">
     <w:abstractNumId w:val="3"/>
+  </w:num>
+  <w:num w:numId="24" w16cid:durableId="1767774477">
+    <w:abstractNumId w:val="13"/>
   </w:num>
 </w:numbering>
 </file>
@@ -14458,6 +16172,7 @@
   <w:style w:type="paragraph" w:default="1" w:styleId="Normal">
     <w:name w:val="Normal"/>
     <w:qFormat/>
+    <w:rsid w:val="004C18BA"/>
   </w:style>
   <w:style w:type="paragraph" w:styleId="Heading1">
     <w:name w:val="heading 1"/>
@@ -14997,6 +16712,50 @@
       <w:shd w:val="clear" w:color="auto" w:fill="E1DFDD"/>
     </w:rPr>
   </w:style>
+  <w:style w:type="paragraph" w:styleId="Header">
+    <w:name w:val="header"/>
+    <w:basedOn w:val="Normal"/>
+    <w:link w:val="HeaderChar"/>
+    <w:uiPriority w:val="99"/>
+    <w:unhideWhenUsed/>
+    <w:rsid w:val="00A64372"/>
+    <w:pPr>
+      <w:tabs>
+        <w:tab w:val="center" w:pos="4680"/>
+        <w:tab w:val="right" w:pos="9360"/>
+      </w:tabs>
+      <w:spacing w:after="0" w:line="240" w:lineRule="auto"/>
+    </w:pPr>
+  </w:style>
+  <w:style w:type="character" w:customStyle="1" w:styleId="HeaderChar">
+    <w:name w:val="Header Char"/>
+    <w:basedOn w:val="DefaultParagraphFont"/>
+    <w:link w:val="Header"/>
+    <w:uiPriority w:val="99"/>
+    <w:rsid w:val="00A64372"/>
+  </w:style>
+  <w:style w:type="paragraph" w:styleId="Footer">
+    <w:name w:val="footer"/>
+    <w:basedOn w:val="Normal"/>
+    <w:link w:val="FooterChar"/>
+    <w:uiPriority w:val="99"/>
+    <w:unhideWhenUsed/>
+    <w:rsid w:val="00A64372"/>
+    <w:pPr>
+      <w:tabs>
+        <w:tab w:val="center" w:pos="4680"/>
+        <w:tab w:val="right" w:pos="9360"/>
+      </w:tabs>
+      <w:spacing w:after="0" w:line="240" w:lineRule="auto"/>
+    </w:pPr>
+  </w:style>
+  <w:style w:type="character" w:customStyle="1" w:styleId="FooterChar">
+    <w:name w:val="Footer Char"/>
+    <w:basedOn w:val="DefaultParagraphFont"/>
+    <w:link w:val="Footer"/>
+    <w:uiPriority w:val="99"/>
+    <w:rsid w:val="00A64372"/>
+  </w:style>
 </w:styles>
 </file>
 

</xml_diff>